<commit_message>
Actualiza guia de Git y elimina archivo temporal
</commit_message>
<xml_diff>
--- a/Guía detallada Git.docx
+++ b/Guía detallada Git.docx
@@ -108,21 +108,8 @@
       </w:r>
     </w:p>
     <w:p>
-      <w:proofErr w:type="spellStart"/>
-      <w:r>
-        <w:t>ssh-keygen</w:t>
-      </w:r>
-      <w:proofErr w:type="spellEnd"/>
-      <w:r>
-        <w:t> -t ed25519 -C "tu-email-de-</w:t>
-      </w:r>
-      <w:proofErr w:type="spellStart"/>
-      <w:r>
-        <w:t>github</w:t>
-      </w:r>
-      <w:proofErr w:type="spellEnd"/>
-      <w:r>
-        <w:t>"</w:t>
+      <w:r>
+        <w:t>ssh-keygen -t ed25519 -C "tu-email-de-github"</w:t>
       </w:r>
     </w:p>
     <w:p>
@@ -141,13 +128,8 @@
       </w:r>
     </w:p>
     <w:p>
-      <w:proofErr w:type="spellStart"/>
-      <w:r>
-        <w:t>ssh-keygen</w:t>
-      </w:r>
-      <w:proofErr w:type="spellEnd"/>
-      <w:r>
-        <w:t> -t ed25519 -C "usuario@gmail.com"</w:t>
+      <w:r>
+        <w:t>ssh-keygen -t ed25519 -C "usuario@gmail.com"</w:t>
       </w:r>
     </w:p>
     <w:p>
@@ -156,47 +138,11 @@
           <w:lang w:val="en-US"/>
         </w:rPr>
       </w:pPr>
-      <w:proofErr w:type="spellStart"/>
       <w:r>
         <w:rPr>
           <w:lang w:val="en-US"/>
         </w:rPr>
-        <w:t>Cuando</w:t>
-      </w:r>
-      <w:proofErr w:type="spellEnd"/>
-      <w:r>
-        <w:rPr>
-          <w:lang w:val="en-US"/>
-        </w:rPr>
-        <w:t xml:space="preserve"> </w:t>
-      </w:r>
-      <w:proofErr w:type="spellStart"/>
-      <w:r>
-        <w:rPr>
-          <w:lang w:val="en-US"/>
-        </w:rPr>
-        <w:t>te</w:t>
-      </w:r>
-      <w:proofErr w:type="spellEnd"/>
-      <w:r>
-        <w:rPr>
-          <w:lang w:val="en-US"/>
-        </w:rPr>
-        <w:t xml:space="preserve"> </w:t>
-      </w:r>
-      <w:proofErr w:type="spellStart"/>
-      <w:r>
-        <w:rPr>
-          <w:lang w:val="en-US"/>
-        </w:rPr>
-        <w:t>pregunte</w:t>
-      </w:r>
-      <w:proofErr w:type="spellEnd"/>
-      <w:r>
-        <w:rPr>
-          <w:lang w:val="en-US"/>
-        </w:rPr>
-        <w:t>:</w:t>
+        <w:t>Cuando te pregunte:</w:t>
       </w:r>
     </w:p>
     <w:p>
@@ -237,13 +183,8 @@
     </w:p>
     <w:p>
       <w:r>
-        <w:t>Enter </w:t>
-      </w:r>
-      <w:proofErr w:type="spellStart"/>
-      <w:r>
-        <w:t>passphrase</w:t>
-      </w:r>
-      <w:proofErr w:type="spellEnd"/>
+        <w:t>Enter passphrase</w:t>
+      </w:r>
     </w:p>
     <w:p>
       <w:r>
@@ -311,34 +252,8 @@
       </w:r>
     </w:p>
     <w:p>
-      <w:proofErr w:type="spellStart"/>
-      <w:r>
-        <w:t>Get</w:t>
-      </w:r>
-      <w:proofErr w:type="spellEnd"/>
-      <w:r>
-        <w:t>-Content "$</w:t>
-      </w:r>
-      <w:proofErr w:type="spellStart"/>
-      <w:proofErr w:type="gramStart"/>
-      <w:r>
-        <w:t>env:USERPROFILE</w:t>
-      </w:r>
-      <w:proofErr w:type="spellEnd"/>
-      <w:r>
-        <w:t>\.</w:t>
-      </w:r>
-      <w:proofErr w:type="spellStart"/>
-      <w:r>
-        <w:t>ssh</w:t>
-      </w:r>
-      <w:proofErr w:type="spellEnd"/>
-      <w:r>
-        <w:t>\id_ed25519.pub</w:t>
-      </w:r>
-      <w:proofErr w:type="gramEnd"/>
-      <w:r>
-        <w:t>"</w:t>
+      <w:r>
+        <w:t>Get-Content "$env:USERPROFILE\.ssh\id_ed25519.pub"</w:t>
       </w:r>
       <w:r>
         <w:t xml:space="preserve"> o vas </w:t>
@@ -429,13 +344,8 @@
         </w:numPr>
       </w:pPr>
       <w:r>
-        <w:t xml:space="preserve">Haz clic en </w:t>
-      </w:r>
-      <w:proofErr w:type="spellStart"/>
-      <w:r>
-        <w:t>Settings</w:t>
-      </w:r>
-      <w:proofErr w:type="spellEnd"/>
+        <w:t>Haz clic en Settings</w:t>
+      </w:r>
     </w:p>
     <w:p>
       <w:pPr>
@@ -445,13 +355,8 @@
         </w:numPr>
       </w:pPr>
       <w:r>
-        <w:t xml:space="preserve">En la barra lateral, entra a SSH and GPG </w:t>
-      </w:r>
-      <w:proofErr w:type="spellStart"/>
-      <w:r>
-        <w:t>keys</w:t>
-      </w:r>
-      <w:proofErr w:type="spellEnd"/>
+        <w:t>En la barra lateral, entra a SSH and GPG keys</w:t>
+      </w:r>
     </w:p>
     <w:p>
       <w:pPr>
@@ -467,35 +372,7 @@
         <w:rPr>
           <w:lang w:val="en-US"/>
         </w:rPr>
-        <w:t xml:space="preserve">Haz </w:t>
-      </w:r>
-      <w:proofErr w:type="spellStart"/>
-      <w:r>
-        <w:rPr>
-          <w:lang w:val="en-US"/>
-        </w:rPr>
-        <w:t>clic</w:t>
-      </w:r>
-      <w:proofErr w:type="spellEnd"/>
-      <w:r>
-        <w:rPr>
-          <w:lang w:val="en-US"/>
-        </w:rPr>
-        <w:t xml:space="preserve"> </w:t>
-      </w:r>
-      <w:proofErr w:type="spellStart"/>
-      <w:r>
-        <w:rPr>
-          <w:lang w:val="en-US"/>
-        </w:rPr>
-        <w:t>en</w:t>
-      </w:r>
-      <w:proofErr w:type="spellEnd"/>
-      <w:r>
-        <w:rPr>
-          <w:lang w:val="en-US"/>
-        </w:rPr>
-        <w:t xml:space="preserve"> New SSH key</w:t>
+        <w:t>Haz clic en New SSH key</w:t>
       </w:r>
     </w:p>
     <w:p>
@@ -586,13 +463,8 @@
       </w:r>
     </w:p>
     <w:p>
-      <w:proofErr w:type="spellStart"/>
-      <w:r>
-        <w:t>ssh</w:t>
-      </w:r>
-      <w:proofErr w:type="spellEnd"/>
-      <w:r>
-        <w:t> -T git@github.com</w:t>
+      <w:r>
+        <w:t>ssh -T git@github.com</w:t>
       </w:r>
     </w:p>
     <w:p>
@@ -647,13 +519,8 @@
       </w:r>
     </w:p>
     <w:p>
-      <w:proofErr w:type="spellStart"/>
-      <w:r>
-        <w:t>git</w:t>
-      </w:r>
-      <w:proofErr w:type="spellEnd"/>
-      <w:r>
-        <w:t> remote -v</w:t>
+      <w:r>
+        <w:t>git remote -v</w:t>
       </w:r>
     </w:p>
     <w:p>
@@ -662,65 +529,13 @@
       </w:r>
     </w:p>
     <w:p>
-      <w:proofErr w:type="spellStart"/>
-      <w:proofErr w:type="gramStart"/>
-      <w:r>
-        <w:t>origin</w:t>
-      </w:r>
-      <w:proofErr w:type="spellEnd"/>
-      <w:r>
-        <w:t>  git@github.com</w:t>
-      </w:r>
-      <w:proofErr w:type="gramEnd"/>
-      <w:r>
-        <w:t>:acabrera11/</w:t>
-      </w:r>
-      <w:proofErr w:type="spellStart"/>
-      <w:r>
-        <w:t>mooc-ia.git</w:t>
-      </w:r>
-      <w:proofErr w:type="spellEnd"/>
-      <w:r>
-        <w:t> (</w:t>
-      </w:r>
-      <w:proofErr w:type="spellStart"/>
-      <w:r>
-        <w:t>fetch</w:t>
-      </w:r>
-      <w:proofErr w:type="spellEnd"/>
-      <w:r>
-        <w:t>)</w:t>
-      </w:r>
-    </w:p>
-    <w:p>
-      <w:proofErr w:type="spellStart"/>
-      <w:proofErr w:type="gramStart"/>
-      <w:r>
-        <w:t>origin</w:t>
-      </w:r>
-      <w:proofErr w:type="spellEnd"/>
-      <w:r>
-        <w:t>  git@github.com</w:t>
-      </w:r>
-      <w:proofErr w:type="gramEnd"/>
-      <w:r>
-        <w:t>:acabrera11/</w:t>
-      </w:r>
-      <w:proofErr w:type="spellStart"/>
-      <w:r>
-        <w:t>mooc-ia.git</w:t>
-      </w:r>
-      <w:proofErr w:type="spellEnd"/>
-      <w:r>
-        <w:t> (</w:t>
-      </w:r>
-      <w:proofErr w:type="spellStart"/>
-      <w:r>
-        <w:t>push</w:t>
-      </w:r>
-      <w:proofErr w:type="spellEnd"/>
-      <w:r>
-        <w:t>)</w:t>
+      <w:r>
+        <w:t>origin  git@github.com:acabrera11/mooc-ia.git (fetch)</w:t>
+      </w:r>
+    </w:p>
+    <w:p>
+      <w:r>
+        <w:t>origin  git@github.com:acabrera11/mooc-ia.git (push)</w:t>
       </w:r>
     </w:p>
     <w:p>
@@ -729,40 +544,9 @@
       </w:r>
     </w:p>
     <w:p>
-      <w:proofErr w:type="spellStart"/>
-      <w:r>
-        <w:t>git</w:t>
-      </w:r>
-      <w:proofErr w:type="spellEnd"/>
-      <w:r>
-        <w:t> remote set-</w:t>
-      </w:r>
-      <w:proofErr w:type="spellStart"/>
-      <w:r>
-        <w:t>url</w:t>
-      </w:r>
-      <w:proofErr w:type="spellEnd"/>
-      <w:r>
-        <w:t> </w:t>
-      </w:r>
-      <w:proofErr w:type="spellStart"/>
-      <w:r>
-        <w:t>origin</w:t>
-      </w:r>
-      <w:proofErr w:type="spellEnd"/>
-      <w:r>
-        <w:t> </w:t>
-      </w:r>
-      <w:proofErr w:type="gramStart"/>
-      <w:r>
-        <w:t>git@github.com:acabrera11/</w:t>
-      </w:r>
-      <w:proofErr w:type="spellStart"/>
-      <w:r>
-        <w:t>mooc-ia.git</w:t>
-      </w:r>
-      <w:proofErr w:type="spellEnd"/>
-      <w:proofErr w:type="gramEnd"/>
+      <w:r>
+        <w:t>git remote set-url origin git@github.com:acabrera11/mooc-ia.git</w:t>
+      </w:r>
     </w:p>
     <w:p>
       <w:r>
@@ -783,201 +567,109 @@
           <w:b/>
           <w:bCs/>
         </w:rPr>
-        <w:t xml:space="preserve">6) Hacer </w:t>
-      </w:r>
-      <w:proofErr w:type="spellStart"/>
-      <w:r>
+        <w:t>6) Hacer commit</w:t>
+      </w:r>
+    </w:p>
+    <w:p>
+      <w:r>
+        <w:t>Cuando hayas editado archivos:</w:t>
+      </w:r>
+    </w:p>
+    <w:p>
+      <w:r>
+        <w:t>git add .</w:t>
+      </w:r>
+    </w:p>
+    <w:p>
+      <w:r>
+        <w:t>git commit -m "Mi mensaje del cambio"</w:t>
+      </w:r>
+    </w:p>
+    <w:p>
+      <w:r>
+        <w:pict w14:anchorId="5EB1B2DD">
+          <v:rect id="_x0000_i1104" style="width:0;height:1.5pt" o:hralign="center" o:hrstd="t" o:hr="t" fillcolor="#a0a0a0" stroked="f"/>
+        </w:pict>
+      </w:r>
+    </w:p>
+    <w:p>
+      <w:pPr>
         <w:rPr>
           <w:b/>
           <w:bCs/>
         </w:rPr>
-        <w:t>commit</w:t>
-      </w:r>
-      <w:proofErr w:type="spellEnd"/>
-    </w:p>
-    <w:p>
-      <w:r>
-        <w:t>Cuando hayas editado archivos:</w:t>
-      </w:r>
-    </w:p>
-    <w:p>
-      <w:proofErr w:type="spellStart"/>
-      <w:r>
-        <w:t>git</w:t>
-      </w:r>
-      <w:proofErr w:type="spellEnd"/>
-      <w:r>
-        <w:t> </w:t>
-      </w:r>
-      <w:proofErr w:type="spellStart"/>
-      <w:proofErr w:type="gramStart"/>
-      <w:r>
-        <w:t>add</w:t>
-      </w:r>
-      <w:proofErr w:type="spellEnd"/>
-      <w:r>
-        <w:t> .</w:t>
-      </w:r>
-      <w:proofErr w:type="gramEnd"/>
-    </w:p>
-    <w:p>
-      <w:proofErr w:type="spellStart"/>
-      <w:r>
-        <w:t>git</w:t>
-      </w:r>
-      <w:proofErr w:type="spellEnd"/>
-      <w:r>
-        <w:t> </w:t>
-      </w:r>
-      <w:proofErr w:type="spellStart"/>
-      <w:r>
-        <w:t>commit</w:t>
-      </w:r>
-      <w:proofErr w:type="spellEnd"/>
-      <w:r>
-        <w:t> -m "Mi mensaje del cambio"</w:t>
-      </w:r>
-    </w:p>
-    <w:p>
-      <w:r>
-        <w:pict w14:anchorId="5EB1B2DD">
-          <v:rect id="_x0000_i1104" style="width:0;height:1.5pt" o:hralign="center" o:hrstd="t" o:hr="t" fillcolor="#a0a0a0" stroked="f"/>
-        </w:pict>
-      </w:r>
-    </w:p>
-    <w:p>
-      <w:pPr>
+      </w:pPr>
+      <w:r>
         <w:rPr>
           <w:b/>
           <w:bCs/>
         </w:rPr>
-      </w:pPr>
-      <w:r>
+        <w:t>7) Hacer push</w:t>
+      </w:r>
+    </w:p>
+    <w:p>
+      <w:r>
+        <w:t>Ejecuta:</w:t>
+      </w:r>
+    </w:p>
+    <w:p>
+      <w:r>
+        <w:t>git push -u origin HEAD</w:t>
+      </w:r>
+    </w:p>
+    <w:p>
+      <w:r>
+        <w:t>Cuando Git use la clave SSH, normalmente te pedirá:</w:t>
+      </w:r>
+    </w:p>
+    <w:p>
+      <w:pPr>
+        <w:rPr>
+          <w:lang w:val="en-US"/>
+        </w:rPr>
+      </w:pPr>
+      <w:r>
+        <w:rPr>
+          <w:lang w:val="en-US"/>
+        </w:rPr>
+        <w:t>Enter passphrase for key '/c/Users/USUARIO/.ssh/id_ed25519':</w:t>
+      </w:r>
+    </w:p>
+    <w:p>
+      <w:r>
+        <w:t>Ahí debes escribir la frase de paso de la clave SSH y presionar Enter.</w:t>
+      </w:r>
+    </w:p>
+    <w:p>
+      <w:r>
+        <w:t>Si todo va bien, el push termina correctamente.</w:t>
+      </w:r>
+    </w:p>
+    <w:p>
+      <w:r>
+        <w:pict w14:anchorId="6227AA97">
+          <v:rect id="_x0000_i1105" style="width:0;height:1.5pt" o:hralign="center" o:hrstd="t" o:hr="t" fillcolor="#a0a0a0" stroked="f"/>
+        </w:pict>
+      </w:r>
+    </w:p>
+    <w:p>
+      <w:pPr>
         <w:rPr>
           <w:b/>
           <w:bCs/>
         </w:rPr>
-        <w:t xml:space="preserve">7) Hacer </w:t>
-      </w:r>
-      <w:proofErr w:type="spellStart"/>
+      </w:pPr>
       <w:r>
         <w:rPr>
           <w:b/>
           <w:bCs/>
         </w:rPr>
-        <w:t>push</w:t>
-      </w:r>
-      <w:proofErr w:type="spellEnd"/>
-    </w:p>
-    <w:p>
-      <w:r>
-        <w:t>Ejecuta:</w:t>
-      </w:r>
-    </w:p>
-    <w:p>
-      <w:proofErr w:type="spellStart"/>
-      <w:r>
-        <w:t>git</w:t>
-      </w:r>
-      <w:proofErr w:type="spellEnd"/>
-      <w:r>
-        <w:t> </w:t>
-      </w:r>
-      <w:proofErr w:type="spellStart"/>
-      <w:r>
-        <w:t>push</w:t>
-      </w:r>
-      <w:proofErr w:type="spellEnd"/>
-      <w:r>
-        <w:t> -u </w:t>
-      </w:r>
-      <w:proofErr w:type="spellStart"/>
-      <w:r>
-        <w:t>origin</w:t>
-      </w:r>
-      <w:proofErr w:type="spellEnd"/>
-      <w:r>
-        <w:t> HEAD</w:t>
-      </w:r>
-    </w:p>
-    <w:p>
-      <w:r>
-        <w:t>Cuando Git use la clave SSH, normalmente te pedirá:</w:t>
-      </w:r>
-    </w:p>
-    <w:p>
-      <w:pPr>
-        <w:rPr>
-          <w:lang w:val="en-US"/>
-        </w:rPr>
-      </w:pPr>
-      <w:r>
-        <w:rPr>
-          <w:lang w:val="en-US"/>
-        </w:rPr>
-        <w:t>Enter passphrase for key '/c/Users/USUARIO/.ssh/id_ed25519':</w:t>
-      </w:r>
-    </w:p>
-    <w:p>
-      <w:r>
-        <w:t>Ahí debes escribir la frase de paso de la clave SSH y presionar Enter.</w:t>
-      </w:r>
-    </w:p>
-    <w:p>
-      <w:r>
-        <w:t xml:space="preserve">Si todo va bien, el </w:t>
-      </w:r>
-      <w:proofErr w:type="spellStart"/>
-      <w:r>
-        <w:t>push</w:t>
-      </w:r>
-      <w:proofErr w:type="spellEnd"/>
-      <w:r>
-        <w:t xml:space="preserve"> termina correctamente.</w:t>
-      </w:r>
-    </w:p>
-    <w:p>
-      <w:r>
-        <w:pict w14:anchorId="6227AA97">
-          <v:rect id="_x0000_i1105" style="width:0;height:1.5pt" o:hralign="center" o:hrstd="t" o:hr="t" fillcolor="#a0a0a0" stroked="f"/>
-        </w:pict>
-      </w:r>
-    </w:p>
-    <w:p>
-      <w:pPr>
-        <w:rPr>
-          <w:b/>
-          <w:bCs/>
-        </w:rPr>
-      </w:pPr>
-      <w:r>
-        <w:rPr>
-          <w:b/>
-          <w:bCs/>
-        </w:rPr>
-        <w:t xml:space="preserve">8) Si falla la </w:t>
-      </w:r>
-      <w:proofErr w:type="spellStart"/>
-      <w:r>
-        <w:rPr>
-          <w:b/>
-          <w:bCs/>
-        </w:rPr>
-        <w:t>passphrase</w:t>
-      </w:r>
-      <w:proofErr w:type="spellEnd"/>
-    </w:p>
-    <w:p>
-      <w:r>
-        <w:t xml:space="preserve">Si te pide </w:t>
-      </w:r>
-      <w:proofErr w:type="spellStart"/>
-      <w:r>
-        <w:t>passphrase</w:t>
-      </w:r>
-      <w:proofErr w:type="spellEnd"/>
-      <w:r>
-        <w:t xml:space="preserve"> y no la recuerdas, hay dos opciones:</w:t>
+        <w:t>8) Si falla la passphrase</w:t>
+      </w:r>
+    </w:p>
+    <w:p>
+      <w:r>
+        <w:t>Si te pide passphrase y no la recuerdas, hay dos opciones:</w:t>
       </w:r>
     </w:p>
     <w:p>
@@ -1022,21 +714,8 @@
       </w:r>
     </w:p>
     <w:p>
-      <w:proofErr w:type="spellStart"/>
-      <w:r>
-        <w:t>ssh-keygen</w:t>
-      </w:r>
-      <w:proofErr w:type="spellEnd"/>
-      <w:r>
-        <w:t> -t ed25519 -C "tu-email-de-</w:t>
-      </w:r>
-      <w:proofErr w:type="spellStart"/>
-      <w:r>
-        <w:t>github</w:t>
-      </w:r>
-      <w:proofErr w:type="spellEnd"/>
-      <w:r>
-        <w:t>"</w:t>
+      <w:r>
+        <w:t>ssh-keygen -t ed25519 -C "tu-email-de-github"</w:t>
       </w:r>
     </w:p>
     <w:p>
@@ -1054,29 +733,7 @@
         <w:rPr>
           <w:lang w:val="en-US"/>
         </w:rPr>
-        <w:t>Get-Content "$</w:t>
-      </w:r>
-      <w:proofErr w:type="spellStart"/>
-      <w:proofErr w:type="gramStart"/>
-      <w:r>
-        <w:rPr>
-          <w:lang w:val="en-US"/>
-        </w:rPr>
-        <w:t>env:USERPROFILE</w:t>
-      </w:r>
-      <w:proofErr w:type="spellEnd"/>
-      <w:r>
-        <w:rPr>
-          <w:lang w:val="en-US"/>
-        </w:rPr>
-        <w:t>\.ssh\id_ed25519.pub</w:t>
-      </w:r>
-      <w:proofErr w:type="gramEnd"/>
-      <w:r>
-        <w:rPr>
-          <w:lang w:val="en-US"/>
-        </w:rPr>
-        <w:t>"</w:t>
+        <w:t>Get-Content "$env:USERPROFILE\.ssh\id_ed25519.pub"</w:t>
       </w:r>
     </w:p>
     <w:p>
@@ -1090,26 +747,13 @@
       </w:r>
     </w:p>
     <w:p>
-      <w:proofErr w:type="spellStart"/>
-      <w:r>
-        <w:t>ssh</w:t>
-      </w:r>
-      <w:proofErr w:type="spellEnd"/>
-      <w:r>
-        <w:t> -T git@github.com</w:t>
-      </w:r>
-    </w:p>
-    <w:p>
-      <w:r>
-        <w:t xml:space="preserve">Y con eso ya puedes seguir con </w:t>
-      </w:r>
-      <w:proofErr w:type="spellStart"/>
-      <w:r>
-        <w:t>push</w:t>
-      </w:r>
-      <w:proofErr w:type="spellEnd"/>
-      <w:r>
-        <w:t>.</w:t>
+      <w:r>
+        <w:t>ssh -T git@github.com</w:t>
+      </w:r>
+    </w:p>
+    <w:p>
+      <w:r>
+        <w:t>Y con eso ya puedes seguir con push.</w:t>
       </w:r>
     </w:p>
     <w:p>
@@ -1201,29 +845,9 @@
       </w:r>
     </w:p>
     <w:p>
-      <w:proofErr w:type="spellStart"/>
-      <w:r>
-        <w:t>git</w:t>
-      </w:r>
-      <w:proofErr w:type="spellEnd"/>
-      <w:r>
-        <w:t> clone </w:t>
-      </w:r>
-      <w:proofErr w:type="spellStart"/>
-      <w:proofErr w:type="gramStart"/>
-      <w:r>
-        <w:t>git@github.com:usuario</w:t>
-      </w:r>
-      <w:proofErr w:type="spellEnd"/>
-      <w:r>
-        <w:t>/</w:t>
-      </w:r>
-      <w:proofErr w:type="spellStart"/>
-      <w:r>
-        <w:t>proyecto.git</w:t>
-      </w:r>
-      <w:proofErr w:type="spellEnd"/>
-      <w:proofErr w:type="gramEnd"/>
+      <w:r>
+        <w:t>git clone git@github.com:usuario/proyecto.git</w:t>
+      </w:r>
     </w:p>
     <w:p>
       <w:r>
@@ -1236,24 +860,9 @@
       </w:r>
     </w:p>
     <w:p>
-      <w:proofErr w:type="spellStart"/>
-      <w:r>
-        <w:t>git</w:t>
-      </w:r>
-      <w:proofErr w:type="spellEnd"/>
-      <w:r>
-        <w:t> </w:t>
-      </w:r>
-      <w:proofErr w:type="spellStart"/>
-      <w:proofErr w:type="gramStart"/>
-      <w:r>
-        <w:t>add</w:t>
-      </w:r>
-      <w:proofErr w:type="spellEnd"/>
-      <w:r>
-        <w:t> .</w:t>
-      </w:r>
-      <w:proofErr w:type="gramEnd"/>
+      <w:r>
+        <w:t>git add .</w:t>
+      </w:r>
     </w:p>
     <w:p>
       <w:pPr>
@@ -1265,21 +874,7 @@
         <w:rPr>
           <w:lang w:val="en-US"/>
         </w:rPr>
-        <w:t>git commit -m "</w:t>
-      </w:r>
-      <w:proofErr w:type="spellStart"/>
-      <w:r>
-        <w:rPr>
-          <w:lang w:val="en-US"/>
-        </w:rPr>
-        <w:t>mensaje</w:t>
-      </w:r>
-      <w:proofErr w:type="spellEnd"/>
-      <w:r>
-        <w:rPr>
-          <w:lang w:val="en-US"/>
-        </w:rPr>
-        <w:t>"</w:t>
+        <w:t>git commit -m "mensaje"</w:t>
       </w:r>
     </w:p>
     <w:p>
@@ -1301,60 +896,14 @@
       </w:r>
     </w:p>
     <w:p>
-      <w:proofErr w:type="spellStart"/>
-      <w:r>
-        <w:t>git</w:t>
-      </w:r>
-      <w:proofErr w:type="spellEnd"/>
-      <w:r>
-        <w:t> </w:t>
-      </w:r>
-      <w:proofErr w:type="spellStart"/>
-      <w:r>
-        <w:t>init</w:t>
-      </w:r>
-      <w:proofErr w:type="spellEnd"/>
-    </w:p>
-    <w:p>
-      <w:proofErr w:type="spellStart"/>
-      <w:r>
-        <w:t>git</w:t>
-      </w:r>
-      <w:proofErr w:type="spellEnd"/>
-      <w:r>
-        <w:t> remote </w:t>
-      </w:r>
-      <w:proofErr w:type="spellStart"/>
-      <w:r>
-        <w:t>add</w:t>
-      </w:r>
-      <w:proofErr w:type="spellEnd"/>
-      <w:r>
-        <w:t> </w:t>
-      </w:r>
-      <w:proofErr w:type="spellStart"/>
-      <w:r>
-        <w:t>origin</w:t>
-      </w:r>
-      <w:proofErr w:type="spellEnd"/>
-      <w:r>
-        <w:t> </w:t>
-      </w:r>
-      <w:proofErr w:type="spellStart"/>
-      <w:proofErr w:type="gramStart"/>
-      <w:r>
-        <w:t>git@github.com:usuario</w:t>
-      </w:r>
-      <w:proofErr w:type="spellEnd"/>
-      <w:r>
-        <w:t>/</w:t>
-      </w:r>
-      <w:proofErr w:type="spellStart"/>
-      <w:r>
-        <w:t>proyecto.git</w:t>
-      </w:r>
-      <w:proofErr w:type="spellEnd"/>
-      <w:proofErr w:type="gramEnd"/>
+      <w:r>
+        <w:t>git init</w:t>
+      </w:r>
+    </w:p>
+    <w:p>
+      <w:r>
+        <w:t>git remote add origin git@github.com:usuario/proyecto.git</w:t>
+      </w:r>
     </w:p>
     <w:p>
       <w:pPr>
@@ -1366,75 +915,27 @@
         <w:rPr>
           <w:lang w:val="en-US"/>
         </w:rPr>
-        <w:t>git </w:t>
-      </w:r>
-      <w:proofErr w:type="gramStart"/>
-      <w:r>
+        <w:t>git add .</w:t>
+      </w:r>
+    </w:p>
+    <w:p>
+      <w:pPr>
         <w:rPr>
           <w:lang w:val="en-US"/>
         </w:rPr>
-        <w:t>add .</w:t>
-      </w:r>
-      <w:proofErr w:type="gramEnd"/>
-    </w:p>
-    <w:p>
-      <w:pPr>
+      </w:pPr>
+      <w:r>
         <w:rPr>
           <w:lang w:val="en-US"/>
         </w:rPr>
-      </w:pPr>
-      <w:r>
-        <w:rPr>
-          <w:lang w:val="en-US"/>
-        </w:rPr>
-        <w:t>git commit -m "</w:t>
-      </w:r>
-      <w:proofErr w:type="spellStart"/>
-      <w:r>
-        <w:rPr>
-          <w:lang w:val="en-US"/>
-        </w:rPr>
-        <w:t>mensaje</w:t>
-      </w:r>
-      <w:proofErr w:type="spellEnd"/>
-      <w:r>
-        <w:rPr>
-          <w:lang w:val="en-US"/>
-        </w:rPr>
-        <w:t>"</w:t>
-      </w:r>
-    </w:p>
-    <w:p>
-      <w:proofErr w:type="spellStart"/>
+        <w:t>git commit -m "mensaje"</w:t>
+      </w:r>
+    </w:p>
+    <w:p>
       <w:r>
         <w:lastRenderedPageBreak/>
-        <w:t>git</w:t>
-      </w:r>
-      <w:proofErr w:type="spellEnd"/>
-      <w:r>
-        <w:t> </w:t>
-      </w:r>
-      <w:proofErr w:type="spellStart"/>
-      <w:r>
-        <w:t>push</w:t>
-      </w:r>
-      <w:proofErr w:type="spellEnd"/>
-      <w:r>
-        <w:t> -u </w:t>
-      </w:r>
-      <w:proofErr w:type="spellStart"/>
-      <w:r>
-        <w:t>origin</w:t>
-      </w:r>
-      <w:proofErr w:type="spellEnd"/>
-      <w:r>
-        <w:t> </w:t>
-      </w:r>
-      <w:proofErr w:type="spellStart"/>
-      <w:r>
-        <w:t>main</w:t>
-      </w:r>
-      <w:proofErr w:type="spellEnd"/>
+        <w:t>git push -u origin main</w:t>
+      </w:r>
     </w:p>
     <w:p>
       <w:r>
@@ -1491,6 +992,541 @@
         <w:pict w14:anchorId="75E99B97">
           <v:rect id="_x0000_i1109" style="width:0;height:1.5pt" o:hralign="center" o:hrstd="t" o:hr="t" fillcolor="#a0a0a0" stroked="f"/>
         </w:pict>
+      </w:r>
+    </w:p>
+    <w:p/>
+    <w:p>
+      <w:pPr>
+        <w:rPr>
+          <w:b/>
+          <w:bCs/>
+          <w:sz w:val="48"/>
+          <w:szCs w:val="48"/>
+        </w:rPr>
+      </w:pPr>
+      <w:r>
+        <w:rPr>
+          <w:b/>
+          <w:bCs/>
+          <w:sz w:val="48"/>
+          <w:szCs w:val="48"/>
+          <w:highlight w:val="yellow"/>
+        </w:rPr>
+        <w:t>Mini práctica de ramas en Git</w:t>
+      </w:r>
+    </w:p>
+    <w:p>
+      <w:r>
+        <w:t>Vamos a simular este flujo:</w:t>
+      </w:r>
+    </w:p>
+    <w:p>
+      <w:pPr>
+        <w:numPr>
+          <w:ilvl w:val="0"/>
+          <w:numId w:val="28"/>
+        </w:numPr>
+      </w:pPr>
+      <w:r>
+        <w:t>main es la rama principal</w:t>
+      </w:r>
+    </w:p>
+    <w:p>
+      <w:pPr>
+        <w:numPr>
+          <w:ilvl w:val="0"/>
+          <w:numId w:val="28"/>
+        </w:numPr>
+      </w:pPr>
+      <w:r>
+        <w:t>desarrollo es una rama de prueba</w:t>
+      </w:r>
+    </w:p>
+    <w:p>
+      <w:pPr>
+        <w:numPr>
+          <w:ilvl w:val="0"/>
+          <w:numId w:val="28"/>
+        </w:numPr>
+      </w:pPr>
+      <w:r>
+        <w:t>luego haremos merge a main</w:t>
+      </w:r>
+    </w:p>
+    <w:p>
+      <w:r>
+        <w:pict w14:anchorId="464BB5D0">
+          <v:rect id="_x0000_i1187" style="width:0;height:1.5pt" o:hralign="center" o:hrstd="t" o:hr="t" fillcolor="#a0a0a0" stroked="f"/>
+        </w:pict>
+      </w:r>
+    </w:p>
+    <w:p>
+      <w:pPr>
+        <w:rPr>
+          <w:b/>
+          <w:bCs/>
+        </w:rPr>
+      </w:pPr>
+      <w:r>
+        <w:rPr>
+          <w:b/>
+          <w:bCs/>
+        </w:rPr>
+        <w:t>1) Ver la rama actual</w:t>
+      </w:r>
+    </w:p>
+    <w:p>
+      <w:r>
+        <w:t>git branch</w:t>
+      </w:r>
+    </w:p>
+    <w:p>
+      <w:r>
+        <w:t>Si solo ves master, entonces tu rama actual es master.</w:t>
+      </w:r>
+    </w:p>
+    <w:p>
+      <w:r>
+        <w:pict w14:anchorId="618AC0EE">
+          <v:rect id="_x0000_i1188" style="width:0;height:1.5pt" o:hralign="center" o:hrstd="t" o:hr="t" fillcolor="#a0a0a0" stroked="f"/>
+        </w:pict>
+      </w:r>
+    </w:p>
+    <w:p>
+      <w:pPr>
+        <w:rPr>
+          <w:b/>
+          <w:bCs/>
+        </w:rPr>
+      </w:pPr>
+      <w:r>
+        <w:rPr>
+          <w:b/>
+          <w:bCs/>
+        </w:rPr>
+        <w:t>2) Crear la rama desarrollo</w:t>
+      </w:r>
+    </w:p>
+    <w:p>
+      <w:r>
+        <w:t>git checkout -b desarrollo</w:t>
+      </w:r>
+    </w:p>
+    <w:p>
+      <w:r>
+        <w:t>o</w:t>
+      </w:r>
+    </w:p>
+    <w:p>
+      <w:r>
+        <w:t>git switch -c desarrollo</w:t>
+      </w:r>
+    </w:p>
+    <w:p>
+      <w:r>
+        <w:t>Ahora estás en desarrollo.</w:t>
+      </w:r>
+    </w:p>
+    <w:p>
+      <w:r>
+        <w:pict w14:anchorId="23185888">
+          <v:rect id="_x0000_i1189" style="width:0;height:1.5pt" o:hralign="center" o:hrstd="t" o:hr="t" fillcolor="#a0a0a0" stroked="f"/>
+        </w:pict>
+      </w:r>
+    </w:p>
+    <w:p>
+      <w:pPr>
+        <w:rPr>
+          <w:b/>
+          <w:bCs/>
+        </w:rPr>
+      </w:pPr>
+      <w:r>
+        <w:rPr>
+          <w:b/>
+          <w:bCs/>
+        </w:rPr>
+        <w:t>3) Hacer cambios</w:t>
+      </w:r>
+    </w:p>
+    <w:p>
+      <w:r>
+        <w:t>Crea un archivo o modifica algo, por ejemplo:</w:t>
+      </w:r>
+    </w:p>
+    <w:p>
+      <w:r>
+        <w:lastRenderedPageBreak/>
+        <w:t>&lt;?php</w:t>
+      </w:r>
+    </w:p>
+    <w:p>
+      <w:r>
+        <w:t>echo "Estoy probando en desarrollo";</w:t>
+      </w:r>
+    </w:p>
+    <w:p>
+      <w:r>
+        <w:pict w14:anchorId="78092CB9">
+          <v:rect id="_x0000_i1190" style="width:0;height:1.5pt" o:hralign="center" o:hrstd="t" o:hr="t" fillcolor="#a0a0a0" stroked="f"/>
+        </w:pict>
+      </w:r>
+    </w:p>
+    <w:p>
+      <w:pPr>
+        <w:rPr>
+          <w:b/>
+          <w:bCs/>
+        </w:rPr>
+      </w:pPr>
+      <w:r>
+        <w:rPr>
+          <w:b/>
+          <w:bCs/>
+        </w:rPr>
+        <w:t>4) Guardar cambios</w:t>
+      </w:r>
+    </w:p>
+    <w:p>
+      <w:r>
+        <w:t>git add .</w:t>
+      </w:r>
+    </w:p>
+    <w:p>
+      <w:r>
+        <w:t>git commit -m "Prueba en desarrollo"</w:t>
+      </w:r>
+    </w:p>
+    <w:p>
+      <w:r>
+        <w:pict w14:anchorId="1305B4D0">
+          <v:rect id="_x0000_i1191" style="width:0;height:1.5pt" o:hralign="center" o:hrstd="t" o:hr="t" fillcolor="#a0a0a0" stroked="f"/>
+        </w:pict>
+      </w:r>
+    </w:p>
+    <w:p>
+      <w:pPr>
+        <w:rPr>
+          <w:b/>
+          <w:bCs/>
+        </w:rPr>
+      </w:pPr>
+      <w:r>
+        <w:rPr>
+          <w:b/>
+          <w:bCs/>
+        </w:rPr>
+        <w:t>5) Ver ramas</w:t>
+      </w:r>
+    </w:p>
+    <w:p>
+      <w:r>
+        <w:t>git branc</w:t>
+      </w:r>
+      <w:r>
+        <w:t>h</w:t>
+      </w:r>
+    </w:p>
+    <w:p>
+      <w:r>
+        <w:t>Verás algo como:</w:t>
+      </w:r>
+    </w:p>
+    <w:p>
+      <w:pPr>
+        <w:ind w:left="708"/>
+      </w:pPr>
+      <w:r>
+        <w:t>* desarrollo</w:t>
+      </w:r>
+    </w:p>
+    <w:p>
+      <w:pPr>
+        <w:ind w:left="708"/>
+      </w:pPr>
+      <w:r>
+        <w:t>  master</w:t>
+      </w:r>
+    </w:p>
+    <w:p>
+      <w:r>
+        <w:pict w14:anchorId="5CF64FED">
+          <v:rect id="_x0000_i1192" style="width:0;height:1.5pt" o:hralign="center" o:hrstd="t" o:hr="t" fillcolor="#a0a0a0" stroked="f"/>
+        </w:pict>
+      </w:r>
+    </w:p>
+    <w:p>
+      <w:pPr>
+        <w:rPr>
+          <w:b/>
+          <w:bCs/>
+          <w:lang w:val="en-US"/>
+        </w:rPr>
+      </w:pPr>
+      <w:r>
+        <w:rPr>
+          <w:b/>
+          <w:bCs/>
+          <w:lang w:val="en-US"/>
+        </w:rPr>
+        <w:t>6) Volver a master</w:t>
+      </w:r>
+    </w:p>
+    <w:p>
+      <w:pPr>
+        <w:rPr>
+          <w:lang w:val="en-US"/>
+        </w:rPr>
+      </w:pPr>
+      <w:r>
+        <w:rPr>
+          <w:lang w:val="en-US"/>
+        </w:rPr>
+        <w:t>git checkout master</w:t>
+      </w:r>
+    </w:p>
+    <w:p>
+      <w:r>
+        <w:t>o</w:t>
+      </w:r>
+    </w:p>
+    <w:p>
+      <w:r>
+        <w:t>git switch master</w:t>
+      </w:r>
+    </w:p>
+    <w:p>
+      <w:r>
+        <w:pict w14:anchorId="7065120F">
+          <v:rect id="_x0000_i1193" style="width:0;height:1.5pt" o:hralign="center" o:hrstd="t" o:hr="t" fillcolor="#a0a0a0" stroked="f"/>
+        </w:pict>
+      </w:r>
+    </w:p>
+    <w:p>
+      <w:pPr>
+        <w:rPr>
+          <w:b/>
+          <w:bCs/>
+        </w:rPr>
+      </w:pPr>
+      <w:r>
+        <w:rPr>
+          <w:b/>
+          <w:bCs/>
+        </w:rPr>
+        <w:t>7) Fusionar desarrollo en master</w:t>
+      </w:r>
+    </w:p>
+    <w:p>
+      <w:r>
+        <w:t>git merge desarrollo</w:t>
+      </w:r>
+    </w:p>
+    <w:p>
+      <w:r>
+        <w:t>Si no hay conflictos, Git integra los cambios.</w:t>
+      </w:r>
+    </w:p>
+    <w:p>
+      <w:r>
+        <w:pict w14:anchorId="7072B6EB">
+          <v:rect id="_x0000_i1194" style="width:0;height:1.5pt" o:hralign="center" o:hrstd="t" o:hr="t" fillcolor="#a0a0a0" stroked="f"/>
+        </w:pict>
+      </w:r>
+    </w:p>
+    <w:p>
+      <w:pPr>
+        <w:rPr>
+          <w:b/>
+          <w:bCs/>
+        </w:rPr>
+      </w:pPr>
+      <w:r>
+        <w:rPr>
+          <w:b/>
+          <w:bCs/>
+        </w:rPr>
+        <w:t>8) Subir a GitHub</w:t>
+      </w:r>
+    </w:p>
+    <w:p>
+      <w:r>
+        <w:t>git push -u origin master</w:t>
+      </w:r>
+    </w:p>
+    <w:p>
+      <w:r>
+        <w:t>si estás en master, o:</w:t>
+      </w:r>
+    </w:p>
+    <w:p>
+      <w:r>
+        <w:t>git push -u origin HEAD</w:t>
+      </w:r>
+    </w:p>
+    <w:p>
+      <w:r>
+        <w:t>si quieres empujar la rama actual sin escribir el nombre.</w:t>
+      </w:r>
+    </w:p>
+    <w:p>
+      <w:r>
+        <w:pict w14:anchorId="7BE03DBE">
+          <v:rect id="_x0000_i1195" style="width:0;height:1.5pt" o:hralign="center" o:hrstd="t" o:hr="t" fillcolor="#a0a0a0" stroked="f"/>
+        </w:pict>
+      </w:r>
+    </w:p>
+    <w:p>
+      <w:pPr>
+        <w:rPr>
+          <w:b/>
+          <w:bCs/>
+        </w:rPr>
+      </w:pPr>
+      <w:r>
+        <w:rPr>
+          <w:b/>
+          <w:bCs/>
+        </w:rPr>
+        <w:lastRenderedPageBreak/>
+        <w:t>9) Volver a desarrollo</w:t>
+      </w:r>
+    </w:p>
+    <w:p>
+      <w:r>
+        <w:t>git checkout desarrollo</w:t>
+      </w:r>
+    </w:p>
+    <w:p>
+      <w:r>
+        <w:pict w14:anchorId="64ADA346">
+          <v:rect id="_x0000_i1196" style="width:0;height:1.5pt" o:hralign="center" o:hrstd="t" o:hr="t" fillcolor="#a0a0a0" stroked="f"/>
+        </w:pict>
+      </w:r>
+    </w:p>
+    <w:p>
+      <w:pPr>
+        <w:rPr>
+          <w:b/>
+          <w:bCs/>
+        </w:rPr>
+      </w:pPr>
+      <w:r>
+        <w:rPr>
+          <w:b/>
+          <w:bCs/>
+        </w:rPr>
+        <w:t>En palabras simples</w:t>
+      </w:r>
+    </w:p>
+    <w:p>
+      <w:r>
+        <w:t>Esto significa:</w:t>
+      </w:r>
+    </w:p>
+    <w:p>
+      <w:pPr>
+        <w:numPr>
+          <w:ilvl w:val="0"/>
+          <w:numId w:val="42"/>
+        </w:numPr>
+      </w:pPr>
+      <w:r>
+        <w:t>creas una rama para probar cosas</w:t>
+      </w:r>
+    </w:p>
+    <w:p>
+      <w:pPr>
+        <w:numPr>
+          <w:ilvl w:val="0"/>
+          <w:numId w:val="42"/>
+        </w:numPr>
+      </w:pPr>
+      <w:r>
+        <w:t>haces cambios ahí</w:t>
+      </w:r>
+    </w:p>
+    <w:p>
+      <w:pPr>
+        <w:numPr>
+          <w:ilvl w:val="0"/>
+          <w:numId w:val="42"/>
+        </w:numPr>
+      </w:pPr>
+      <w:r>
+        <w:t>si funcionan, los llevas a la rama principal</w:t>
+      </w:r>
+    </w:p>
+    <w:p>
+      <w:pPr>
+        <w:numPr>
+          <w:ilvl w:val="0"/>
+          <w:numId w:val="42"/>
+        </w:numPr>
+      </w:pPr>
+      <w:r>
+        <w:t>luego puedes volver a la rama de prueba para seguir trabajando</w:t>
+      </w:r>
+    </w:p>
+    <w:p>
+      <w:r>
+        <w:pict w14:anchorId="745D9B01">
+          <v:rect id="_x0000_i1197" style="width:0;height:1.5pt" o:hralign="center" o:hrstd="t" o:hr="t" fillcolor="#a0a0a0" stroked="f"/>
+        </w:pict>
+      </w:r>
+    </w:p>
+    <w:p>
+      <w:pPr>
+        <w:rPr>
+          <w:b/>
+          <w:bCs/>
+        </w:rPr>
+      </w:pPr>
+      <w:r>
+        <w:rPr>
+          <w:b/>
+          <w:bCs/>
+        </w:rPr>
+        <w:t>Ejemplo visual</w:t>
+      </w:r>
+    </w:p>
+    <w:p>
+      <w:r>
+        <w:drawing>
+          <wp:inline distT="0" distB="0" distL="0" distR="0" wp14:anchorId="52CC783B" wp14:editId="583D5312">
+            <wp:extent cx="5400040" cy="989330"/>
+            <wp:effectExtent l="0" t="0" r="0" b="1270"/>
+            <wp:docPr id="1321835571" name="Imagen 1"/>
+            <wp:cNvGraphicFramePr>
+              <a:graphicFrameLocks xmlns:a="http://schemas.openxmlformats.org/drawingml/2006/main" noChangeAspect="1"/>
+            </wp:cNvGraphicFramePr>
+            <a:graphic xmlns:a="http://schemas.openxmlformats.org/drawingml/2006/main">
+              <a:graphicData uri="http://schemas.openxmlformats.org/drawingml/2006/picture">
+                <pic:pic xmlns:pic="http://schemas.openxmlformats.org/drawingml/2006/picture">
+                  <pic:nvPicPr>
+                    <pic:cNvPr id="1321835571" name=""/>
+                    <pic:cNvPicPr/>
+                  </pic:nvPicPr>
+                  <pic:blipFill>
+                    <a:blip r:embed="rId5"/>
+                    <a:stretch>
+                      <a:fillRect/>
+                    </a:stretch>
+                  </pic:blipFill>
+                  <pic:spPr>
+                    <a:xfrm>
+                      <a:off x="0" y="0"/>
+                      <a:ext cx="5400040" cy="989330"/>
+                    </a:xfrm>
+                    <a:prstGeom prst="rect">
+                      <a:avLst/>
+                    </a:prstGeom>
+                  </pic:spPr>
+                </pic:pic>
+              </a:graphicData>
+            </a:graphic>
+          </wp:inline>
+        </w:drawing>
       </w:r>
     </w:p>
     <w:sectPr>
@@ -1921,6 +1957,304 @@
     </w:lvl>
   </w:abstractNum>
   <w:abstractNum w:abstractNumId="3" w15:restartNumberingAfterBreak="0">
+    <w:nsid w:val="08084724"/>
+    <w:multiLevelType w:val="multilevel"/>
+    <w:tmpl w:val="C7441050"/>
+    <w:lvl w:ilvl="0">
+      <w:start w:val="1"/>
+      <w:numFmt w:val="bullet"/>
+      <w:lvlText w:val=""/>
+      <w:lvlJc w:val="left"/>
+      <w:pPr>
+        <w:tabs>
+          <w:tab w:val="num" w:pos="720"/>
+        </w:tabs>
+        <w:ind w:left="720" w:hanging="360"/>
+      </w:pPr>
+      <w:rPr>
+        <w:rFonts w:ascii="Symbol" w:hAnsi="Symbol" w:hint="default"/>
+        <w:sz w:val="20"/>
+      </w:rPr>
+    </w:lvl>
+    <w:lvl w:ilvl="1" w:tentative="1">
+      <w:start w:val="1"/>
+      <w:numFmt w:val="bullet"/>
+      <w:lvlText w:val="o"/>
+      <w:lvlJc w:val="left"/>
+      <w:pPr>
+        <w:tabs>
+          <w:tab w:val="num" w:pos="1440"/>
+        </w:tabs>
+        <w:ind w:left="1440" w:hanging="360"/>
+      </w:pPr>
+      <w:rPr>
+        <w:rFonts w:ascii="Courier New" w:hAnsi="Courier New" w:hint="default"/>
+        <w:sz w:val="20"/>
+      </w:rPr>
+    </w:lvl>
+    <w:lvl w:ilvl="2" w:tentative="1">
+      <w:start w:val="1"/>
+      <w:numFmt w:val="bullet"/>
+      <w:lvlText w:val=""/>
+      <w:lvlJc w:val="left"/>
+      <w:pPr>
+        <w:tabs>
+          <w:tab w:val="num" w:pos="2160"/>
+        </w:tabs>
+        <w:ind w:left="2160" w:hanging="360"/>
+      </w:pPr>
+      <w:rPr>
+        <w:rFonts w:ascii="Wingdings" w:hAnsi="Wingdings" w:hint="default"/>
+        <w:sz w:val="20"/>
+      </w:rPr>
+    </w:lvl>
+    <w:lvl w:ilvl="3" w:tentative="1">
+      <w:start w:val="1"/>
+      <w:numFmt w:val="bullet"/>
+      <w:lvlText w:val=""/>
+      <w:lvlJc w:val="left"/>
+      <w:pPr>
+        <w:tabs>
+          <w:tab w:val="num" w:pos="2880"/>
+        </w:tabs>
+        <w:ind w:left="2880" w:hanging="360"/>
+      </w:pPr>
+      <w:rPr>
+        <w:rFonts w:ascii="Wingdings" w:hAnsi="Wingdings" w:hint="default"/>
+        <w:sz w:val="20"/>
+      </w:rPr>
+    </w:lvl>
+    <w:lvl w:ilvl="4" w:tentative="1">
+      <w:start w:val="1"/>
+      <w:numFmt w:val="bullet"/>
+      <w:lvlText w:val=""/>
+      <w:lvlJc w:val="left"/>
+      <w:pPr>
+        <w:tabs>
+          <w:tab w:val="num" w:pos="3600"/>
+        </w:tabs>
+        <w:ind w:left="3600" w:hanging="360"/>
+      </w:pPr>
+      <w:rPr>
+        <w:rFonts w:ascii="Wingdings" w:hAnsi="Wingdings" w:hint="default"/>
+        <w:sz w:val="20"/>
+      </w:rPr>
+    </w:lvl>
+    <w:lvl w:ilvl="5" w:tentative="1">
+      <w:start w:val="1"/>
+      <w:numFmt w:val="bullet"/>
+      <w:lvlText w:val=""/>
+      <w:lvlJc w:val="left"/>
+      <w:pPr>
+        <w:tabs>
+          <w:tab w:val="num" w:pos="4320"/>
+        </w:tabs>
+        <w:ind w:left="4320" w:hanging="360"/>
+      </w:pPr>
+      <w:rPr>
+        <w:rFonts w:ascii="Wingdings" w:hAnsi="Wingdings" w:hint="default"/>
+        <w:sz w:val="20"/>
+      </w:rPr>
+    </w:lvl>
+    <w:lvl w:ilvl="6" w:tentative="1">
+      <w:start w:val="1"/>
+      <w:numFmt w:val="bullet"/>
+      <w:lvlText w:val=""/>
+      <w:lvlJc w:val="left"/>
+      <w:pPr>
+        <w:tabs>
+          <w:tab w:val="num" w:pos="5040"/>
+        </w:tabs>
+        <w:ind w:left="5040" w:hanging="360"/>
+      </w:pPr>
+      <w:rPr>
+        <w:rFonts w:ascii="Wingdings" w:hAnsi="Wingdings" w:hint="default"/>
+        <w:sz w:val="20"/>
+      </w:rPr>
+    </w:lvl>
+    <w:lvl w:ilvl="7" w:tentative="1">
+      <w:start w:val="1"/>
+      <w:numFmt w:val="bullet"/>
+      <w:lvlText w:val=""/>
+      <w:lvlJc w:val="left"/>
+      <w:pPr>
+        <w:tabs>
+          <w:tab w:val="num" w:pos="5760"/>
+        </w:tabs>
+        <w:ind w:left="5760" w:hanging="360"/>
+      </w:pPr>
+      <w:rPr>
+        <w:rFonts w:ascii="Wingdings" w:hAnsi="Wingdings" w:hint="default"/>
+        <w:sz w:val="20"/>
+      </w:rPr>
+    </w:lvl>
+    <w:lvl w:ilvl="8" w:tentative="1">
+      <w:start w:val="1"/>
+      <w:numFmt w:val="bullet"/>
+      <w:lvlText w:val=""/>
+      <w:lvlJc w:val="left"/>
+      <w:pPr>
+        <w:tabs>
+          <w:tab w:val="num" w:pos="6480"/>
+        </w:tabs>
+        <w:ind w:left="6480" w:hanging="360"/>
+      </w:pPr>
+      <w:rPr>
+        <w:rFonts w:ascii="Wingdings" w:hAnsi="Wingdings" w:hint="default"/>
+        <w:sz w:val="20"/>
+      </w:rPr>
+    </w:lvl>
+  </w:abstractNum>
+  <w:abstractNum w:abstractNumId="4" w15:restartNumberingAfterBreak="0">
+    <w:nsid w:val="089C7C6D"/>
+    <w:multiLevelType w:val="multilevel"/>
+    <w:tmpl w:val="7494DFB6"/>
+    <w:lvl w:ilvl="0">
+      <w:start w:val="1"/>
+      <w:numFmt w:val="bullet"/>
+      <w:lvlText w:val=""/>
+      <w:lvlJc w:val="left"/>
+      <w:pPr>
+        <w:tabs>
+          <w:tab w:val="num" w:pos="720"/>
+        </w:tabs>
+        <w:ind w:left="720" w:hanging="360"/>
+      </w:pPr>
+      <w:rPr>
+        <w:rFonts w:ascii="Symbol" w:hAnsi="Symbol" w:hint="default"/>
+        <w:sz w:val="20"/>
+      </w:rPr>
+    </w:lvl>
+    <w:lvl w:ilvl="1" w:tentative="1">
+      <w:start w:val="1"/>
+      <w:numFmt w:val="bullet"/>
+      <w:lvlText w:val="o"/>
+      <w:lvlJc w:val="left"/>
+      <w:pPr>
+        <w:tabs>
+          <w:tab w:val="num" w:pos="1440"/>
+        </w:tabs>
+        <w:ind w:left="1440" w:hanging="360"/>
+      </w:pPr>
+      <w:rPr>
+        <w:rFonts w:ascii="Courier New" w:hAnsi="Courier New" w:hint="default"/>
+        <w:sz w:val="20"/>
+      </w:rPr>
+    </w:lvl>
+    <w:lvl w:ilvl="2" w:tentative="1">
+      <w:start w:val="1"/>
+      <w:numFmt w:val="bullet"/>
+      <w:lvlText w:val=""/>
+      <w:lvlJc w:val="left"/>
+      <w:pPr>
+        <w:tabs>
+          <w:tab w:val="num" w:pos="2160"/>
+        </w:tabs>
+        <w:ind w:left="2160" w:hanging="360"/>
+      </w:pPr>
+      <w:rPr>
+        <w:rFonts w:ascii="Wingdings" w:hAnsi="Wingdings" w:hint="default"/>
+        <w:sz w:val="20"/>
+      </w:rPr>
+    </w:lvl>
+    <w:lvl w:ilvl="3" w:tentative="1">
+      <w:start w:val="1"/>
+      <w:numFmt w:val="bullet"/>
+      <w:lvlText w:val=""/>
+      <w:lvlJc w:val="left"/>
+      <w:pPr>
+        <w:tabs>
+          <w:tab w:val="num" w:pos="2880"/>
+        </w:tabs>
+        <w:ind w:left="2880" w:hanging="360"/>
+      </w:pPr>
+      <w:rPr>
+        <w:rFonts w:ascii="Wingdings" w:hAnsi="Wingdings" w:hint="default"/>
+        <w:sz w:val="20"/>
+      </w:rPr>
+    </w:lvl>
+    <w:lvl w:ilvl="4" w:tentative="1">
+      <w:start w:val="1"/>
+      <w:numFmt w:val="bullet"/>
+      <w:lvlText w:val=""/>
+      <w:lvlJc w:val="left"/>
+      <w:pPr>
+        <w:tabs>
+          <w:tab w:val="num" w:pos="3600"/>
+        </w:tabs>
+        <w:ind w:left="3600" w:hanging="360"/>
+      </w:pPr>
+      <w:rPr>
+        <w:rFonts w:ascii="Wingdings" w:hAnsi="Wingdings" w:hint="default"/>
+        <w:sz w:val="20"/>
+      </w:rPr>
+    </w:lvl>
+    <w:lvl w:ilvl="5" w:tentative="1">
+      <w:start w:val="1"/>
+      <w:numFmt w:val="bullet"/>
+      <w:lvlText w:val=""/>
+      <w:lvlJc w:val="left"/>
+      <w:pPr>
+        <w:tabs>
+          <w:tab w:val="num" w:pos="4320"/>
+        </w:tabs>
+        <w:ind w:left="4320" w:hanging="360"/>
+      </w:pPr>
+      <w:rPr>
+        <w:rFonts w:ascii="Wingdings" w:hAnsi="Wingdings" w:hint="default"/>
+        <w:sz w:val="20"/>
+      </w:rPr>
+    </w:lvl>
+    <w:lvl w:ilvl="6" w:tentative="1">
+      <w:start w:val="1"/>
+      <w:numFmt w:val="bullet"/>
+      <w:lvlText w:val=""/>
+      <w:lvlJc w:val="left"/>
+      <w:pPr>
+        <w:tabs>
+          <w:tab w:val="num" w:pos="5040"/>
+        </w:tabs>
+        <w:ind w:left="5040" w:hanging="360"/>
+      </w:pPr>
+      <w:rPr>
+        <w:rFonts w:ascii="Wingdings" w:hAnsi="Wingdings" w:hint="default"/>
+        <w:sz w:val="20"/>
+      </w:rPr>
+    </w:lvl>
+    <w:lvl w:ilvl="7" w:tentative="1">
+      <w:start w:val="1"/>
+      <w:numFmt w:val="bullet"/>
+      <w:lvlText w:val=""/>
+      <w:lvlJc w:val="left"/>
+      <w:pPr>
+        <w:tabs>
+          <w:tab w:val="num" w:pos="5760"/>
+        </w:tabs>
+        <w:ind w:left="5760" w:hanging="360"/>
+      </w:pPr>
+      <w:rPr>
+        <w:rFonts w:ascii="Wingdings" w:hAnsi="Wingdings" w:hint="default"/>
+        <w:sz w:val="20"/>
+      </w:rPr>
+    </w:lvl>
+    <w:lvl w:ilvl="8" w:tentative="1">
+      <w:start w:val="1"/>
+      <w:numFmt w:val="bullet"/>
+      <w:lvlText w:val=""/>
+      <w:lvlJc w:val="left"/>
+      <w:pPr>
+        <w:tabs>
+          <w:tab w:val="num" w:pos="6480"/>
+        </w:tabs>
+        <w:ind w:left="6480" w:hanging="360"/>
+      </w:pPr>
+      <w:rPr>
+        <w:rFonts w:ascii="Wingdings" w:hAnsi="Wingdings" w:hint="default"/>
+        <w:sz w:val="20"/>
+      </w:rPr>
+    </w:lvl>
+  </w:abstractNum>
+  <w:abstractNum w:abstractNumId="5" w15:restartNumberingAfterBreak="0">
     <w:nsid w:val="0D8551B4"/>
     <w:multiLevelType w:val="multilevel"/>
     <w:tmpl w:val="6CDEEE0E"/>
@@ -2069,7 +2403,305 @@
       </w:rPr>
     </w:lvl>
   </w:abstractNum>
-  <w:abstractNum w:abstractNumId="4" w15:restartNumberingAfterBreak="0">
+  <w:abstractNum w:abstractNumId="6" w15:restartNumberingAfterBreak="0">
+    <w:nsid w:val="0DBC2180"/>
+    <w:multiLevelType w:val="multilevel"/>
+    <w:tmpl w:val="B524DDD0"/>
+    <w:lvl w:ilvl="0">
+      <w:start w:val="1"/>
+      <w:numFmt w:val="bullet"/>
+      <w:lvlText w:val=""/>
+      <w:lvlJc w:val="left"/>
+      <w:pPr>
+        <w:tabs>
+          <w:tab w:val="num" w:pos="720"/>
+        </w:tabs>
+        <w:ind w:left="720" w:hanging="360"/>
+      </w:pPr>
+      <w:rPr>
+        <w:rFonts w:ascii="Symbol" w:hAnsi="Symbol" w:hint="default"/>
+        <w:sz w:val="20"/>
+      </w:rPr>
+    </w:lvl>
+    <w:lvl w:ilvl="1" w:tentative="1">
+      <w:start w:val="1"/>
+      <w:numFmt w:val="bullet"/>
+      <w:lvlText w:val="o"/>
+      <w:lvlJc w:val="left"/>
+      <w:pPr>
+        <w:tabs>
+          <w:tab w:val="num" w:pos="1440"/>
+        </w:tabs>
+        <w:ind w:left="1440" w:hanging="360"/>
+      </w:pPr>
+      <w:rPr>
+        <w:rFonts w:ascii="Courier New" w:hAnsi="Courier New" w:hint="default"/>
+        <w:sz w:val="20"/>
+      </w:rPr>
+    </w:lvl>
+    <w:lvl w:ilvl="2" w:tentative="1">
+      <w:start w:val="1"/>
+      <w:numFmt w:val="bullet"/>
+      <w:lvlText w:val=""/>
+      <w:lvlJc w:val="left"/>
+      <w:pPr>
+        <w:tabs>
+          <w:tab w:val="num" w:pos="2160"/>
+        </w:tabs>
+        <w:ind w:left="2160" w:hanging="360"/>
+      </w:pPr>
+      <w:rPr>
+        <w:rFonts w:ascii="Wingdings" w:hAnsi="Wingdings" w:hint="default"/>
+        <w:sz w:val="20"/>
+      </w:rPr>
+    </w:lvl>
+    <w:lvl w:ilvl="3" w:tentative="1">
+      <w:start w:val="1"/>
+      <w:numFmt w:val="bullet"/>
+      <w:lvlText w:val=""/>
+      <w:lvlJc w:val="left"/>
+      <w:pPr>
+        <w:tabs>
+          <w:tab w:val="num" w:pos="2880"/>
+        </w:tabs>
+        <w:ind w:left="2880" w:hanging="360"/>
+      </w:pPr>
+      <w:rPr>
+        <w:rFonts w:ascii="Wingdings" w:hAnsi="Wingdings" w:hint="default"/>
+        <w:sz w:val="20"/>
+      </w:rPr>
+    </w:lvl>
+    <w:lvl w:ilvl="4" w:tentative="1">
+      <w:start w:val="1"/>
+      <w:numFmt w:val="bullet"/>
+      <w:lvlText w:val=""/>
+      <w:lvlJc w:val="left"/>
+      <w:pPr>
+        <w:tabs>
+          <w:tab w:val="num" w:pos="3600"/>
+        </w:tabs>
+        <w:ind w:left="3600" w:hanging="360"/>
+      </w:pPr>
+      <w:rPr>
+        <w:rFonts w:ascii="Wingdings" w:hAnsi="Wingdings" w:hint="default"/>
+        <w:sz w:val="20"/>
+      </w:rPr>
+    </w:lvl>
+    <w:lvl w:ilvl="5" w:tentative="1">
+      <w:start w:val="1"/>
+      <w:numFmt w:val="bullet"/>
+      <w:lvlText w:val=""/>
+      <w:lvlJc w:val="left"/>
+      <w:pPr>
+        <w:tabs>
+          <w:tab w:val="num" w:pos="4320"/>
+        </w:tabs>
+        <w:ind w:left="4320" w:hanging="360"/>
+      </w:pPr>
+      <w:rPr>
+        <w:rFonts w:ascii="Wingdings" w:hAnsi="Wingdings" w:hint="default"/>
+        <w:sz w:val="20"/>
+      </w:rPr>
+    </w:lvl>
+    <w:lvl w:ilvl="6" w:tentative="1">
+      <w:start w:val="1"/>
+      <w:numFmt w:val="bullet"/>
+      <w:lvlText w:val=""/>
+      <w:lvlJc w:val="left"/>
+      <w:pPr>
+        <w:tabs>
+          <w:tab w:val="num" w:pos="5040"/>
+        </w:tabs>
+        <w:ind w:left="5040" w:hanging="360"/>
+      </w:pPr>
+      <w:rPr>
+        <w:rFonts w:ascii="Wingdings" w:hAnsi="Wingdings" w:hint="default"/>
+        <w:sz w:val="20"/>
+      </w:rPr>
+    </w:lvl>
+    <w:lvl w:ilvl="7" w:tentative="1">
+      <w:start w:val="1"/>
+      <w:numFmt w:val="bullet"/>
+      <w:lvlText w:val=""/>
+      <w:lvlJc w:val="left"/>
+      <w:pPr>
+        <w:tabs>
+          <w:tab w:val="num" w:pos="5760"/>
+        </w:tabs>
+        <w:ind w:left="5760" w:hanging="360"/>
+      </w:pPr>
+      <w:rPr>
+        <w:rFonts w:ascii="Wingdings" w:hAnsi="Wingdings" w:hint="default"/>
+        <w:sz w:val="20"/>
+      </w:rPr>
+    </w:lvl>
+    <w:lvl w:ilvl="8" w:tentative="1">
+      <w:start w:val="1"/>
+      <w:numFmt w:val="bullet"/>
+      <w:lvlText w:val=""/>
+      <w:lvlJc w:val="left"/>
+      <w:pPr>
+        <w:tabs>
+          <w:tab w:val="num" w:pos="6480"/>
+        </w:tabs>
+        <w:ind w:left="6480" w:hanging="360"/>
+      </w:pPr>
+      <w:rPr>
+        <w:rFonts w:ascii="Wingdings" w:hAnsi="Wingdings" w:hint="default"/>
+        <w:sz w:val="20"/>
+      </w:rPr>
+    </w:lvl>
+  </w:abstractNum>
+  <w:abstractNum w:abstractNumId="7" w15:restartNumberingAfterBreak="0">
+    <w:nsid w:val="107B7514"/>
+    <w:multiLevelType w:val="multilevel"/>
+    <w:tmpl w:val="A814B79E"/>
+    <w:lvl w:ilvl="0">
+      <w:start w:val="1"/>
+      <w:numFmt w:val="bullet"/>
+      <w:lvlText w:val=""/>
+      <w:lvlJc w:val="left"/>
+      <w:pPr>
+        <w:tabs>
+          <w:tab w:val="num" w:pos="720"/>
+        </w:tabs>
+        <w:ind w:left="720" w:hanging="360"/>
+      </w:pPr>
+      <w:rPr>
+        <w:rFonts w:ascii="Symbol" w:hAnsi="Symbol" w:hint="default"/>
+        <w:sz w:val="20"/>
+      </w:rPr>
+    </w:lvl>
+    <w:lvl w:ilvl="1" w:tentative="1">
+      <w:start w:val="1"/>
+      <w:numFmt w:val="bullet"/>
+      <w:lvlText w:val="o"/>
+      <w:lvlJc w:val="left"/>
+      <w:pPr>
+        <w:tabs>
+          <w:tab w:val="num" w:pos="1440"/>
+        </w:tabs>
+        <w:ind w:left="1440" w:hanging="360"/>
+      </w:pPr>
+      <w:rPr>
+        <w:rFonts w:ascii="Courier New" w:hAnsi="Courier New" w:hint="default"/>
+        <w:sz w:val="20"/>
+      </w:rPr>
+    </w:lvl>
+    <w:lvl w:ilvl="2" w:tentative="1">
+      <w:start w:val="1"/>
+      <w:numFmt w:val="bullet"/>
+      <w:lvlText w:val=""/>
+      <w:lvlJc w:val="left"/>
+      <w:pPr>
+        <w:tabs>
+          <w:tab w:val="num" w:pos="2160"/>
+        </w:tabs>
+        <w:ind w:left="2160" w:hanging="360"/>
+      </w:pPr>
+      <w:rPr>
+        <w:rFonts w:ascii="Wingdings" w:hAnsi="Wingdings" w:hint="default"/>
+        <w:sz w:val="20"/>
+      </w:rPr>
+    </w:lvl>
+    <w:lvl w:ilvl="3" w:tentative="1">
+      <w:start w:val="1"/>
+      <w:numFmt w:val="bullet"/>
+      <w:lvlText w:val=""/>
+      <w:lvlJc w:val="left"/>
+      <w:pPr>
+        <w:tabs>
+          <w:tab w:val="num" w:pos="2880"/>
+        </w:tabs>
+        <w:ind w:left="2880" w:hanging="360"/>
+      </w:pPr>
+      <w:rPr>
+        <w:rFonts w:ascii="Wingdings" w:hAnsi="Wingdings" w:hint="default"/>
+        <w:sz w:val="20"/>
+      </w:rPr>
+    </w:lvl>
+    <w:lvl w:ilvl="4" w:tentative="1">
+      <w:start w:val="1"/>
+      <w:numFmt w:val="bullet"/>
+      <w:lvlText w:val=""/>
+      <w:lvlJc w:val="left"/>
+      <w:pPr>
+        <w:tabs>
+          <w:tab w:val="num" w:pos="3600"/>
+        </w:tabs>
+        <w:ind w:left="3600" w:hanging="360"/>
+      </w:pPr>
+      <w:rPr>
+        <w:rFonts w:ascii="Wingdings" w:hAnsi="Wingdings" w:hint="default"/>
+        <w:sz w:val="20"/>
+      </w:rPr>
+    </w:lvl>
+    <w:lvl w:ilvl="5" w:tentative="1">
+      <w:start w:val="1"/>
+      <w:numFmt w:val="bullet"/>
+      <w:lvlText w:val=""/>
+      <w:lvlJc w:val="left"/>
+      <w:pPr>
+        <w:tabs>
+          <w:tab w:val="num" w:pos="4320"/>
+        </w:tabs>
+        <w:ind w:left="4320" w:hanging="360"/>
+      </w:pPr>
+      <w:rPr>
+        <w:rFonts w:ascii="Wingdings" w:hAnsi="Wingdings" w:hint="default"/>
+        <w:sz w:val="20"/>
+      </w:rPr>
+    </w:lvl>
+    <w:lvl w:ilvl="6" w:tentative="1">
+      <w:start w:val="1"/>
+      <w:numFmt w:val="bullet"/>
+      <w:lvlText w:val=""/>
+      <w:lvlJc w:val="left"/>
+      <w:pPr>
+        <w:tabs>
+          <w:tab w:val="num" w:pos="5040"/>
+        </w:tabs>
+        <w:ind w:left="5040" w:hanging="360"/>
+      </w:pPr>
+      <w:rPr>
+        <w:rFonts w:ascii="Wingdings" w:hAnsi="Wingdings" w:hint="default"/>
+        <w:sz w:val="20"/>
+      </w:rPr>
+    </w:lvl>
+    <w:lvl w:ilvl="7" w:tentative="1">
+      <w:start w:val="1"/>
+      <w:numFmt w:val="bullet"/>
+      <w:lvlText w:val=""/>
+      <w:lvlJc w:val="left"/>
+      <w:pPr>
+        <w:tabs>
+          <w:tab w:val="num" w:pos="5760"/>
+        </w:tabs>
+        <w:ind w:left="5760" w:hanging="360"/>
+      </w:pPr>
+      <w:rPr>
+        <w:rFonts w:ascii="Wingdings" w:hAnsi="Wingdings" w:hint="default"/>
+        <w:sz w:val="20"/>
+      </w:rPr>
+    </w:lvl>
+    <w:lvl w:ilvl="8" w:tentative="1">
+      <w:start w:val="1"/>
+      <w:numFmt w:val="bullet"/>
+      <w:lvlText w:val=""/>
+      <w:lvlJc w:val="left"/>
+      <w:pPr>
+        <w:tabs>
+          <w:tab w:val="num" w:pos="6480"/>
+        </w:tabs>
+        <w:ind w:left="6480" w:hanging="360"/>
+      </w:pPr>
+      <w:rPr>
+        <w:rFonts w:ascii="Wingdings" w:hAnsi="Wingdings" w:hint="default"/>
+        <w:sz w:val="20"/>
+      </w:rPr>
+    </w:lvl>
+  </w:abstractNum>
+  <w:abstractNum w:abstractNumId="8" w15:restartNumberingAfterBreak="0">
     <w:nsid w:val="16CF4A85"/>
     <w:multiLevelType w:val="multilevel"/>
     <w:tmpl w:val="44D61CEA"/>
@@ -2218,7 +2850,7 @@
       </w:rPr>
     </w:lvl>
   </w:abstractNum>
-  <w:abstractNum w:abstractNumId="5" w15:restartNumberingAfterBreak="0">
+  <w:abstractNum w:abstractNumId="9" w15:restartNumberingAfterBreak="0">
     <w:nsid w:val="1C326E33"/>
     <w:multiLevelType w:val="multilevel"/>
     <w:tmpl w:val="D69A4F3C"/>
@@ -2367,7 +2999,7 @@
       </w:rPr>
     </w:lvl>
   </w:abstractNum>
-  <w:abstractNum w:abstractNumId="6" w15:restartNumberingAfterBreak="0">
+  <w:abstractNum w:abstractNumId="10" w15:restartNumberingAfterBreak="0">
     <w:nsid w:val="1DE46639"/>
     <w:multiLevelType w:val="multilevel"/>
     <w:tmpl w:val="D6CE1AC4"/>
@@ -2516,7 +3148,7 @@
       </w:rPr>
     </w:lvl>
   </w:abstractNum>
-  <w:abstractNum w:abstractNumId="7" w15:restartNumberingAfterBreak="0">
+  <w:abstractNum w:abstractNumId="11" w15:restartNumberingAfterBreak="0">
     <w:nsid w:val="2ABC3531"/>
     <w:multiLevelType w:val="multilevel"/>
     <w:tmpl w:val="C8D40198"/>
@@ -2665,7 +3297,7 @@
       </w:rPr>
     </w:lvl>
   </w:abstractNum>
-  <w:abstractNum w:abstractNumId="8" w15:restartNumberingAfterBreak="0">
+  <w:abstractNum w:abstractNumId="12" w15:restartNumberingAfterBreak="0">
     <w:nsid w:val="2F4F2D1F"/>
     <w:multiLevelType w:val="multilevel"/>
     <w:tmpl w:val="90FC8936"/>
@@ -2814,7 +3446,7 @@
       </w:rPr>
     </w:lvl>
   </w:abstractNum>
-  <w:abstractNum w:abstractNumId="9" w15:restartNumberingAfterBreak="0">
+  <w:abstractNum w:abstractNumId="13" w15:restartNumberingAfterBreak="0">
     <w:nsid w:val="313A41E4"/>
     <w:multiLevelType w:val="multilevel"/>
     <w:tmpl w:val="2080201A"/>
@@ -2963,7 +3595,7 @@
       </w:rPr>
     </w:lvl>
   </w:abstractNum>
-  <w:abstractNum w:abstractNumId="10" w15:restartNumberingAfterBreak="0">
+  <w:abstractNum w:abstractNumId="14" w15:restartNumberingAfterBreak="0">
     <w:nsid w:val="32540C02"/>
     <w:multiLevelType w:val="multilevel"/>
     <w:tmpl w:val="93A0D28C"/>
@@ -3112,7 +3744,7 @@
       </w:rPr>
     </w:lvl>
   </w:abstractNum>
-  <w:abstractNum w:abstractNumId="11" w15:restartNumberingAfterBreak="0">
+  <w:abstractNum w:abstractNumId="15" w15:restartNumberingAfterBreak="0">
     <w:nsid w:val="32DA091A"/>
     <w:multiLevelType w:val="multilevel"/>
     <w:tmpl w:val="D5384CC0"/>
@@ -3261,7 +3893,156 @@
       </w:rPr>
     </w:lvl>
   </w:abstractNum>
-  <w:abstractNum w:abstractNumId="12" w15:restartNumberingAfterBreak="0">
+  <w:abstractNum w:abstractNumId="16" w15:restartNumberingAfterBreak="0">
+    <w:nsid w:val="357F1741"/>
+    <w:multiLevelType w:val="multilevel"/>
+    <w:tmpl w:val="9E6AD010"/>
+    <w:lvl w:ilvl="0">
+      <w:start w:val="1"/>
+      <w:numFmt w:val="bullet"/>
+      <w:lvlText w:val=""/>
+      <w:lvlJc w:val="left"/>
+      <w:pPr>
+        <w:tabs>
+          <w:tab w:val="num" w:pos="720"/>
+        </w:tabs>
+        <w:ind w:left="720" w:hanging="360"/>
+      </w:pPr>
+      <w:rPr>
+        <w:rFonts w:ascii="Symbol" w:hAnsi="Symbol" w:hint="default"/>
+        <w:sz w:val="20"/>
+      </w:rPr>
+    </w:lvl>
+    <w:lvl w:ilvl="1" w:tentative="1">
+      <w:start w:val="1"/>
+      <w:numFmt w:val="bullet"/>
+      <w:lvlText w:val="o"/>
+      <w:lvlJc w:val="left"/>
+      <w:pPr>
+        <w:tabs>
+          <w:tab w:val="num" w:pos="1440"/>
+        </w:tabs>
+        <w:ind w:left="1440" w:hanging="360"/>
+      </w:pPr>
+      <w:rPr>
+        <w:rFonts w:ascii="Courier New" w:hAnsi="Courier New" w:hint="default"/>
+        <w:sz w:val="20"/>
+      </w:rPr>
+    </w:lvl>
+    <w:lvl w:ilvl="2" w:tentative="1">
+      <w:start w:val="1"/>
+      <w:numFmt w:val="bullet"/>
+      <w:lvlText w:val=""/>
+      <w:lvlJc w:val="left"/>
+      <w:pPr>
+        <w:tabs>
+          <w:tab w:val="num" w:pos="2160"/>
+        </w:tabs>
+        <w:ind w:left="2160" w:hanging="360"/>
+      </w:pPr>
+      <w:rPr>
+        <w:rFonts w:ascii="Wingdings" w:hAnsi="Wingdings" w:hint="default"/>
+        <w:sz w:val="20"/>
+      </w:rPr>
+    </w:lvl>
+    <w:lvl w:ilvl="3" w:tentative="1">
+      <w:start w:val="1"/>
+      <w:numFmt w:val="bullet"/>
+      <w:lvlText w:val=""/>
+      <w:lvlJc w:val="left"/>
+      <w:pPr>
+        <w:tabs>
+          <w:tab w:val="num" w:pos="2880"/>
+        </w:tabs>
+        <w:ind w:left="2880" w:hanging="360"/>
+      </w:pPr>
+      <w:rPr>
+        <w:rFonts w:ascii="Wingdings" w:hAnsi="Wingdings" w:hint="default"/>
+        <w:sz w:val="20"/>
+      </w:rPr>
+    </w:lvl>
+    <w:lvl w:ilvl="4" w:tentative="1">
+      <w:start w:val="1"/>
+      <w:numFmt w:val="bullet"/>
+      <w:lvlText w:val=""/>
+      <w:lvlJc w:val="left"/>
+      <w:pPr>
+        <w:tabs>
+          <w:tab w:val="num" w:pos="3600"/>
+        </w:tabs>
+        <w:ind w:left="3600" w:hanging="360"/>
+      </w:pPr>
+      <w:rPr>
+        <w:rFonts w:ascii="Wingdings" w:hAnsi="Wingdings" w:hint="default"/>
+        <w:sz w:val="20"/>
+      </w:rPr>
+    </w:lvl>
+    <w:lvl w:ilvl="5" w:tentative="1">
+      <w:start w:val="1"/>
+      <w:numFmt w:val="bullet"/>
+      <w:lvlText w:val=""/>
+      <w:lvlJc w:val="left"/>
+      <w:pPr>
+        <w:tabs>
+          <w:tab w:val="num" w:pos="4320"/>
+        </w:tabs>
+        <w:ind w:left="4320" w:hanging="360"/>
+      </w:pPr>
+      <w:rPr>
+        <w:rFonts w:ascii="Wingdings" w:hAnsi="Wingdings" w:hint="default"/>
+        <w:sz w:val="20"/>
+      </w:rPr>
+    </w:lvl>
+    <w:lvl w:ilvl="6" w:tentative="1">
+      <w:start w:val="1"/>
+      <w:numFmt w:val="bullet"/>
+      <w:lvlText w:val=""/>
+      <w:lvlJc w:val="left"/>
+      <w:pPr>
+        <w:tabs>
+          <w:tab w:val="num" w:pos="5040"/>
+        </w:tabs>
+        <w:ind w:left="5040" w:hanging="360"/>
+      </w:pPr>
+      <w:rPr>
+        <w:rFonts w:ascii="Wingdings" w:hAnsi="Wingdings" w:hint="default"/>
+        <w:sz w:val="20"/>
+      </w:rPr>
+    </w:lvl>
+    <w:lvl w:ilvl="7" w:tentative="1">
+      <w:start w:val="1"/>
+      <w:numFmt w:val="bullet"/>
+      <w:lvlText w:val=""/>
+      <w:lvlJc w:val="left"/>
+      <w:pPr>
+        <w:tabs>
+          <w:tab w:val="num" w:pos="5760"/>
+        </w:tabs>
+        <w:ind w:left="5760" w:hanging="360"/>
+      </w:pPr>
+      <w:rPr>
+        <w:rFonts w:ascii="Wingdings" w:hAnsi="Wingdings" w:hint="default"/>
+        <w:sz w:val="20"/>
+      </w:rPr>
+    </w:lvl>
+    <w:lvl w:ilvl="8" w:tentative="1">
+      <w:start w:val="1"/>
+      <w:numFmt w:val="bullet"/>
+      <w:lvlText w:val=""/>
+      <w:lvlJc w:val="left"/>
+      <w:pPr>
+        <w:tabs>
+          <w:tab w:val="num" w:pos="6480"/>
+        </w:tabs>
+        <w:ind w:left="6480" w:hanging="360"/>
+      </w:pPr>
+      <w:rPr>
+        <w:rFonts w:ascii="Wingdings" w:hAnsi="Wingdings" w:hint="default"/>
+        <w:sz w:val="20"/>
+      </w:rPr>
+    </w:lvl>
+  </w:abstractNum>
+  <w:abstractNum w:abstractNumId="17" w15:restartNumberingAfterBreak="0">
     <w:nsid w:val="35AC3F27"/>
     <w:multiLevelType w:val="multilevel"/>
     <w:tmpl w:val="E8BC1CAE"/>
@@ -3410,7 +4191,305 @@
       </w:rPr>
     </w:lvl>
   </w:abstractNum>
-  <w:abstractNum w:abstractNumId="13" w15:restartNumberingAfterBreak="0">
+  <w:abstractNum w:abstractNumId="18" w15:restartNumberingAfterBreak="0">
+    <w:nsid w:val="38E72D1B"/>
+    <w:multiLevelType w:val="multilevel"/>
+    <w:tmpl w:val="5B4C056C"/>
+    <w:lvl w:ilvl="0">
+      <w:start w:val="1"/>
+      <w:numFmt w:val="bullet"/>
+      <w:lvlText w:val=""/>
+      <w:lvlJc w:val="left"/>
+      <w:pPr>
+        <w:tabs>
+          <w:tab w:val="num" w:pos="720"/>
+        </w:tabs>
+        <w:ind w:left="720" w:hanging="360"/>
+      </w:pPr>
+      <w:rPr>
+        <w:rFonts w:ascii="Symbol" w:hAnsi="Symbol" w:hint="default"/>
+        <w:sz w:val="20"/>
+      </w:rPr>
+    </w:lvl>
+    <w:lvl w:ilvl="1" w:tentative="1">
+      <w:start w:val="1"/>
+      <w:numFmt w:val="bullet"/>
+      <w:lvlText w:val="o"/>
+      <w:lvlJc w:val="left"/>
+      <w:pPr>
+        <w:tabs>
+          <w:tab w:val="num" w:pos="1440"/>
+        </w:tabs>
+        <w:ind w:left="1440" w:hanging="360"/>
+      </w:pPr>
+      <w:rPr>
+        <w:rFonts w:ascii="Courier New" w:hAnsi="Courier New" w:hint="default"/>
+        <w:sz w:val="20"/>
+      </w:rPr>
+    </w:lvl>
+    <w:lvl w:ilvl="2" w:tentative="1">
+      <w:start w:val="1"/>
+      <w:numFmt w:val="bullet"/>
+      <w:lvlText w:val=""/>
+      <w:lvlJc w:val="left"/>
+      <w:pPr>
+        <w:tabs>
+          <w:tab w:val="num" w:pos="2160"/>
+        </w:tabs>
+        <w:ind w:left="2160" w:hanging="360"/>
+      </w:pPr>
+      <w:rPr>
+        <w:rFonts w:ascii="Wingdings" w:hAnsi="Wingdings" w:hint="default"/>
+        <w:sz w:val="20"/>
+      </w:rPr>
+    </w:lvl>
+    <w:lvl w:ilvl="3" w:tentative="1">
+      <w:start w:val="1"/>
+      <w:numFmt w:val="bullet"/>
+      <w:lvlText w:val=""/>
+      <w:lvlJc w:val="left"/>
+      <w:pPr>
+        <w:tabs>
+          <w:tab w:val="num" w:pos="2880"/>
+        </w:tabs>
+        <w:ind w:left="2880" w:hanging="360"/>
+      </w:pPr>
+      <w:rPr>
+        <w:rFonts w:ascii="Wingdings" w:hAnsi="Wingdings" w:hint="default"/>
+        <w:sz w:val="20"/>
+      </w:rPr>
+    </w:lvl>
+    <w:lvl w:ilvl="4" w:tentative="1">
+      <w:start w:val="1"/>
+      <w:numFmt w:val="bullet"/>
+      <w:lvlText w:val=""/>
+      <w:lvlJc w:val="left"/>
+      <w:pPr>
+        <w:tabs>
+          <w:tab w:val="num" w:pos="3600"/>
+        </w:tabs>
+        <w:ind w:left="3600" w:hanging="360"/>
+      </w:pPr>
+      <w:rPr>
+        <w:rFonts w:ascii="Wingdings" w:hAnsi="Wingdings" w:hint="default"/>
+        <w:sz w:val="20"/>
+      </w:rPr>
+    </w:lvl>
+    <w:lvl w:ilvl="5" w:tentative="1">
+      <w:start w:val="1"/>
+      <w:numFmt w:val="bullet"/>
+      <w:lvlText w:val=""/>
+      <w:lvlJc w:val="left"/>
+      <w:pPr>
+        <w:tabs>
+          <w:tab w:val="num" w:pos="4320"/>
+        </w:tabs>
+        <w:ind w:left="4320" w:hanging="360"/>
+      </w:pPr>
+      <w:rPr>
+        <w:rFonts w:ascii="Wingdings" w:hAnsi="Wingdings" w:hint="default"/>
+        <w:sz w:val="20"/>
+      </w:rPr>
+    </w:lvl>
+    <w:lvl w:ilvl="6" w:tentative="1">
+      <w:start w:val="1"/>
+      <w:numFmt w:val="bullet"/>
+      <w:lvlText w:val=""/>
+      <w:lvlJc w:val="left"/>
+      <w:pPr>
+        <w:tabs>
+          <w:tab w:val="num" w:pos="5040"/>
+        </w:tabs>
+        <w:ind w:left="5040" w:hanging="360"/>
+      </w:pPr>
+      <w:rPr>
+        <w:rFonts w:ascii="Wingdings" w:hAnsi="Wingdings" w:hint="default"/>
+        <w:sz w:val="20"/>
+      </w:rPr>
+    </w:lvl>
+    <w:lvl w:ilvl="7" w:tentative="1">
+      <w:start w:val="1"/>
+      <w:numFmt w:val="bullet"/>
+      <w:lvlText w:val=""/>
+      <w:lvlJc w:val="left"/>
+      <w:pPr>
+        <w:tabs>
+          <w:tab w:val="num" w:pos="5760"/>
+        </w:tabs>
+        <w:ind w:left="5760" w:hanging="360"/>
+      </w:pPr>
+      <w:rPr>
+        <w:rFonts w:ascii="Wingdings" w:hAnsi="Wingdings" w:hint="default"/>
+        <w:sz w:val="20"/>
+      </w:rPr>
+    </w:lvl>
+    <w:lvl w:ilvl="8" w:tentative="1">
+      <w:start w:val="1"/>
+      <w:numFmt w:val="bullet"/>
+      <w:lvlText w:val=""/>
+      <w:lvlJc w:val="left"/>
+      <w:pPr>
+        <w:tabs>
+          <w:tab w:val="num" w:pos="6480"/>
+        </w:tabs>
+        <w:ind w:left="6480" w:hanging="360"/>
+      </w:pPr>
+      <w:rPr>
+        <w:rFonts w:ascii="Wingdings" w:hAnsi="Wingdings" w:hint="default"/>
+        <w:sz w:val="20"/>
+      </w:rPr>
+    </w:lvl>
+  </w:abstractNum>
+  <w:abstractNum w:abstractNumId="19" w15:restartNumberingAfterBreak="0">
+    <w:nsid w:val="39F1149F"/>
+    <w:multiLevelType w:val="multilevel"/>
+    <w:tmpl w:val="B4D627A4"/>
+    <w:lvl w:ilvl="0">
+      <w:start w:val="1"/>
+      <w:numFmt w:val="bullet"/>
+      <w:lvlText w:val=""/>
+      <w:lvlJc w:val="left"/>
+      <w:pPr>
+        <w:tabs>
+          <w:tab w:val="num" w:pos="720"/>
+        </w:tabs>
+        <w:ind w:left="720" w:hanging="360"/>
+      </w:pPr>
+      <w:rPr>
+        <w:rFonts w:ascii="Symbol" w:hAnsi="Symbol" w:hint="default"/>
+        <w:sz w:val="20"/>
+      </w:rPr>
+    </w:lvl>
+    <w:lvl w:ilvl="1" w:tentative="1">
+      <w:start w:val="1"/>
+      <w:numFmt w:val="bullet"/>
+      <w:lvlText w:val="o"/>
+      <w:lvlJc w:val="left"/>
+      <w:pPr>
+        <w:tabs>
+          <w:tab w:val="num" w:pos="1440"/>
+        </w:tabs>
+        <w:ind w:left="1440" w:hanging="360"/>
+      </w:pPr>
+      <w:rPr>
+        <w:rFonts w:ascii="Courier New" w:hAnsi="Courier New" w:hint="default"/>
+        <w:sz w:val="20"/>
+      </w:rPr>
+    </w:lvl>
+    <w:lvl w:ilvl="2" w:tentative="1">
+      <w:start w:val="1"/>
+      <w:numFmt w:val="bullet"/>
+      <w:lvlText w:val=""/>
+      <w:lvlJc w:val="left"/>
+      <w:pPr>
+        <w:tabs>
+          <w:tab w:val="num" w:pos="2160"/>
+        </w:tabs>
+        <w:ind w:left="2160" w:hanging="360"/>
+      </w:pPr>
+      <w:rPr>
+        <w:rFonts w:ascii="Wingdings" w:hAnsi="Wingdings" w:hint="default"/>
+        <w:sz w:val="20"/>
+      </w:rPr>
+    </w:lvl>
+    <w:lvl w:ilvl="3" w:tentative="1">
+      <w:start w:val="1"/>
+      <w:numFmt w:val="bullet"/>
+      <w:lvlText w:val=""/>
+      <w:lvlJc w:val="left"/>
+      <w:pPr>
+        <w:tabs>
+          <w:tab w:val="num" w:pos="2880"/>
+        </w:tabs>
+        <w:ind w:left="2880" w:hanging="360"/>
+      </w:pPr>
+      <w:rPr>
+        <w:rFonts w:ascii="Wingdings" w:hAnsi="Wingdings" w:hint="default"/>
+        <w:sz w:val="20"/>
+      </w:rPr>
+    </w:lvl>
+    <w:lvl w:ilvl="4" w:tentative="1">
+      <w:start w:val="1"/>
+      <w:numFmt w:val="bullet"/>
+      <w:lvlText w:val=""/>
+      <w:lvlJc w:val="left"/>
+      <w:pPr>
+        <w:tabs>
+          <w:tab w:val="num" w:pos="3600"/>
+        </w:tabs>
+        <w:ind w:left="3600" w:hanging="360"/>
+      </w:pPr>
+      <w:rPr>
+        <w:rFonts w:ascii="Wingdings" w:hAnsi="Wingdings" w:hint="default"/>
+        <w:sz w:val="20"/>
+      </w:rPr>
+    </w:lvl>
+    <w:lvl w:ilvl="5" w:tentative="1">
+      <w:start w:val="1"/>
+      <w:numFmt w:val="bullet"/>
+      <w:lvlText w:val=""/>
+      <w:lvlJc w:val="left"/>
+      <w:pPr>
+        <w:tabs>
+          <w:tab w:val="num" w:pos="4320"/>
+        </w:tabs>
+        <w:ind w:left="4320" w:hanging="360"/>
+      </w:pPr>
+      <w:rPr>
+        <w:rFonts w:ascii="Wingdings" w:hAnsi="Wingdings" w:hint="default"/>
+        <w:sz w:val="20"/>
+      </w:rPr>
+    </w:lvl>
+    <w:lvl w:ilvl="6" w:tentative="1">
+      <w:start w:val="1"/>
+      <w:numFmt w:val="bullet"/>
+      <w:lvlText w:val=""/>
+      <w:lvlJc w:val="left"/>
+      <w:pPr>
+        <w:tabs>
+          <w:tab w:val="num" w:pos="5040"/>
+        </w:tabs>
+        <w:ind w:left="5040" w:hanging="360"/>
+      </w:pPr>
+      <w:rPr>
+        <w:rFonts w:ascii="Wingdings" w:hAnsi="Wingdings" w:hint="default"/>
+        <w:sz w:val="20"/>
+      </w:rPr>
+    </w:lvl>
+    <w:lvl w:ilvl="7" w:tentative="1">
+      <w:start w:val="1"/>
+      <w:numFmt w:val="bullet"/>
+      <w:lvlText w:val=""/>
+      <w:lvlJc w:val="left"/>
+      <w:pPr>
+        <w:tabs>
+          <w:tab w:val="num" w:pos="5760"/>
+        </w:tabs>
+        <w:ind w:left="5760" w:hanging="360"/>
+      </w:pPr>
+      <w:rPr>
+        <w:rFonts w:ascii="Wingdings" w:hAnsi="Wingdings" w:hint="default"/>
+        <w:sz w:val="20"/>
+      </w:rPr>
+    </w:lvl>
+    <w:lvl w:ilvl="8" w:tentative="1">
+      <w:start w:val="1"/>
+      <w:numFmt w:val="bullet"/>
+      <w:lvlText w:val=""/>
+      <w:lvlJc w:val="left"/>
+      <w:pPr>
+        <w:tabs>
+          <w:tab w:val="num" w:pos="6480"/>
+        </w:tabs>
+        <w:ind w:left="6480" w:hanging="360"/>
+      </w:pPr>
+      <w:rPr>
+        <w:rFonts w:ascii="Wingdings" w:hAnsi="Wingdings" w:hint="default"/>
+        <w:sz w:val="20"/>
+      </w:rPr>
+    </w:lvl>
+  </w:abstractNum>
+  <w:abstractNum w:abstractNumId="20" w15:restartNumberingAfterBreak="0">
     <w:nsid w:val="3A4B02F5"/>
     <w:multiLevelType w:val="multilevel"/>
     <w:tmpl w:val="2A546480"/>
@@ -3559,7 +4638,305 @@
       </w:rPr>
     </w:lvl>
   </w:abstractNum>
-  <w:abstractNum w:abstractNumId="14" w15:restartNumberingAfterBreak="0">
+  <w:abstractNum w:abstractNumId="21" w15:restartNumberingAfterBreak="0">
+    <w:nsid w:val="3B5161B5"/>
+    <w:multiLevelType w:val="multilevel"/>
+    <w:tmpl w:val="2D36EF1C"/>
+    <w:lvl w:ilvl="0">
+      <w:start w:val="1"/>
+      <w:numFmt w:val="bullet"/>
+      <w:lvlText w:val=""/>
+      <w:lvlJc w:val="left"/>
+      <w:pPr>
+        <w:tabs>
+          <w:tab w:val="num" w:pos="720"/>
+        </w:tabs>
+        <w:ind w:left="720" w:hanging="360"/>
+      </w:pPr>
+      <w:rPr>
+        <w:rFonts w:ascii="Symbol" w:hAnsi="Symbol" w:hint="default"/>
+        <w:sz w:val="20"/>
+      </w:rPr>
+    </w:lvl>
+    <w:lvl w:ilvl="1" w:tentative="1">
+      <w:start w:val="1"/>
+      <w:numFmt w:val="bullet"/>
+      <w:lvlText w:val="o"/>
+      <w:lvlJc w:val="left"/>
+      <w:pPr>
+        <w:tabs>
+          <w:tab w:val="num" w:pos="1440"/>
+        </w:tabs>
+        <w:ind w:left="1440" w:hanging="360"/>
+      </w:pPr>
+      <w:rPr>
+        <w:rFonts w:ascii="Courier New" w:hAnsi="Courier New" w:hint="default"/>
+        <w:sz w:val="20"/>
+      </w:rPr>
+    </w:lvl>
+    <w:lvl w:ilvl="2" w:tentative="1">
+      <w:start w:val="1"/>
+      <w:numFmt w:val="bullet"/>
+      <w:lvlText w:val=""/>
+      <w:lvlJc w:val="left"/>
+      <w:pPr>
+        <w:tabs>
+          <w:tab w:val="num" w:pos="2160"/>
+        </w:tabs>
+        <w:ind w:left="2160" w:hanging="360"/>
+      </w:pPr>
+      <w:rPr>
+        <w:rFonts w:ascii="Wingdings" w:hAnsi="Wingdings" w:hint="default"/>
+        <w:sz w:val="20"/>
+      </w:rPr>
+    </w:lvl>
+    <w:lvl w:ilvl="3" w:tentative="1">
+      <w:start w:val="1"/>
+      <w:numFmt w:val="bullet"/>
+      <w:lvlText w:val=""/>
+      <w:lvlJc w:val="left"/>
+      <w:pPr>
+        <w:tabs>
+          <w:tab w:val="num" w:pos="2880"/>
+        </w:tabs>
+        <w:ind w:left="2880" w:hanging="360"/>
+      </w:pPr>
+      <w:rPr>
+        <w:rFonts w:ascii="Wingdings" w:hAnsi="Wingdings" w:hint="default"/>
+        <w:sz w:val="20"/>
+      </w:rPr>
+    </w:lvl>
+    <w:lvl w:ilvl="4" w:tentative="1">
+      <w:start w:val="1"/>
+      <w:numFmt w:val="bullet"/>
+      <w:lvlText w:val=""/>
+      <w:lvlJc w:val="left"/>
+      <w:pPr>
+        <w:tabs>
+          <w:tab w:val="num" w:pos="3600"/>
+        </w:tabs>
+        <w:ind w:left="3600" w:hanging="360"/>
+      </w:pPr>
+      <w:rPr>
+        <w:rFonts w:ascii="Wingdings" w:hAnsi="Wingdings" w:hint="default"/>
+        <w:sz w:val="20"/>
+      </w:rPr>
+    </w:lvl>
+    <w:lvl w:ilvl="5" w:tentative="1">
+      <w:start w:val="1"/>
+      <w:numFmt w:val="bullet"/>
+      <w:lvlText w:val=""/>
+      <w:lvlJc w:val="left"/>
+      <w:pPr>
+        <w:tabs>
+          <w:tab w:val="num" w:pos="4320"/>
+        </w:tabs>
+        <w:ind w:left="4320" w:hanging="360"/>
+      </w:pPr>
+      <w:rPr>
+        <w:rFonts w:ascii="Wingdings" w:hAnsi="Wingdings" w:hint="default"/>
+        <w:sz w:val="20"/>
+      </w:rPr>
+    </w:lvl>
+    <w:lvl w:ilvl="6" w:tentative="1">
+      <w:start w:val="1"/>
+      <w:numFmt w:val="bullet"/>
+      <w:lvlText w:val=""/>
+      <w:lvlJc w:val="left"/>
+      <w:pPr>
+        <w:tabs>
+          <w:tab w:val="num" w:pos="5040"/>
+        </w:tabs>
+        <w:ind w:left="5040" w:hanging="360"/>
+      </w:pPr>
+      <w:rPr>
+        <w:rFonts w:ascii="Wingdings" w:hAnsi="Wingdings" w:hint="default"/>
+        <w:sz w:val="20"/>
+      </w:rPr>
+    </w:lvl>
+    <w:lvl w:ilvl="7" w:tentative="1">
+      <w:start w:val="1"/>
+      <w:numFmt w:val="bullet"/>
+      <w:lvlText w:val=""/>
+      <w:lvlJc w:val="left"/>
+      <w:pPr>
+        <w:tabs>
+          <w:tab w:val="num" w:pos="5760"/>
+        </w:tabs>
+        <w:ind w:left="5760" w:hanging="360"/>
+      </w:pPr>
+      <w:rPr>
+        <w:rFonts w:ascii="Wingdings" w:hAnsi="Wingdings" w:hint="default"/>
+        <w:sz w:val="20"/>
+      </w:rPr>
+    </w:lvl>
+    <w:lvl w:ilvl="8" w:tentative="1">
+      <w:start w:val="1"/>
+      <w:numFmt w:val="bullet"/>
+      <w:lvlText w:val=""/>
+      <w:lvlJc w:val="left"/>
+      <w:pPr>
+        <w:tabs>
+          <w:tab w:val="num" w:pos="6480"/>
+        </w:tabs>
+        <w:ind w:left="6480" w:hanging="360"/>
+      </w:pPr>
+      <w:rPr>
+        <w:rFonts w:ascii="Wingdings" w:hAnsi="Wingdings" w:hint="default"/>
+        <w:sz w:val="20"/>
+      </w:rPr>
+    </w:lvl>
+  </w:abstractNum>
+  <w:abstractNum w:abstractNumId="22" w15:restartNumberingAfterBreak="0">
+    <w:nsid w:val="3C08317B"/>
+    <w:multiLevelType w:val="multilevel"/>
+    <w:tmpl w:val="EDC8C24A"/>
+    <w:lvl w:ilvl="0">
+      <w:start w:val="1"/>
+      <w:numFmt w:val="bullet"/>
+      <w:lvlText w:val=""/>
+      <w:lvlJc w:val="left"/>
+      <w:pPr>
+        <w:tabs>
+          <w:tab w:val="num" w:pos="720"/>
+        </w:tabs>
+        <w:ind w:left="720" w:hanging="360"/>
+      </w:pPr>
+      <w:rPr>
+        <w:rFonts w:ascii="Symbol" w:hAnsi="Symbol" w:hint="default"/>
+        <w:sz w:val="20"/>
+      </w:rPr>
+    </w:lvl>
+    <w:lvl w:ilvl="1" w:tentative="1">
+      <w:start w:val="1"/>
+      <w:numFmt w:val="bullet"/>
+      <w:lvlText w:val="o"/>
+      <w:lvlJc w:val="left"/>
+      <w:pPr>
+        <w:tabs>
+          <w:tab w:val="num" w:pos="1440"/>
+        </w:tabs>
+        <w:ind w:left="1440" w:hanging="360"/>
+      </w:pPr>
+      <w:rPr>
+        <w:rFonts w:ascii="Courier New" w:hAnsi="Courier New" w:hint="default"/>
+        <w:sz w:val="20"/>
+      </w:rPr>
+    </w:lvl>
+    <w:lvl w:ilvl="2" w:tentative="1">
+      <w:start w:val="1"/>
+      <w:numFmt w:val="bullet"/>
+      <w:lvlText w:val=""/>
+      <w:lvlJc w:val="left"/>
+      <w:pPr>
+        <w:tabs>
+          <w:tab w:val="num" w:pos="2160"/>
+        </w:tabs>
+        <w:ind w:left="2160" w:hanging="360"/>
+      </w:pPr>
+      <w:rPr>
+        <w:rFonts w:ascii="Wingdings" w:hAnsi="Wingdings" w:hint="default"/>
+        <w:sz w:val="20"/>
+      </w:rPr>
+    </w:lvl>
+    <w:lvl w:ilvl="3" w:tentative="1">
+      <w:start w:val="1"/>
+      <w:numFmt w:val="bullet"/>
+      <w:lvlText w:val=""/>
+      <w:lvlJc w:val="left"/>
+      <w:pPr>
+        <w:tabs>
+          <w:tab w:val="num" w:pos="2880"/>
+        </w:tabs>
+        <w:ind w:left="2880" w:hanging="360"/>
+      </w:pPr>
+      <w:rPr>
+        <w:rFonts w:ascii="Wingdings" w:hAnsi="Wingdings" w:hint="default"/>
+        <w:sz w:val="20"/>
+      </w:rPr>
+    </w:lvl>
+    <w:lvl w:ilvl="4" w:tentative="1">
+      <w:start w:val="1"/>
+      <w:numFmt w:val="bullet"/>
+      <w:lvlText w:val=""/>
+      <w:lvlJc w:val="left"/>
+      <w:pPr>
+        <w:tabs>
+          <w:tab w:val="num" w:pos="3600"/>
+        </w:tabs>
+        <w:ind w:left="3600" w:hanging="360"/>
+      </w:pPr>
+      <w:rPr>
+        <w:rFonts w:ascii="Wingdings" w:hAnsi="Wingdings" w:hint="default"/>
+        <w:sz w:val="20"/>
+      </w:rPr>
+    </w:lvl>
+    <w:lvl w:ilvl="5" w:tentative="1">
+      <w:start w:val="1"/>
+      <w:numFmt w:val="bullet"/>
+      <w:lvlText w:val=""/>
+      <w:lvlJc w:val="left"/>
+      <w:pPr>
+        <w:tabs>
+          <w:tab w:val="num" w:pos="4320"/>
+        </w:tabs>
+        <w:ind w:left="4320" w:hanging="360"/>
+      </w:pPr>
+      <w:rPr>
+        <w:rFonts w:ascii="Wingdings" w:hAnsi="Wingdings" w:hint="default"/>
+        <w:sz w:val="20"/>
+      </w:rPr>
+    </w:lvl>
+    <w:lvl w:ilvl="6" w:tentative="1">
+      <w:start w:val="1"/>
+      <w:numFmt w:val="bullet"/>
+      <w:lvlText w:val=""/>
+      <w:lvlJc w:val="left"/>
+      <w:pPr>
+        <w:tabs>
+          <w:tab w:val="num" w:pos="5040"/>
+        </w:tabs>
+        <w:ind w:left="5040" w:hanging="360"/>
+      </w:pPr>
+      <w:rPr>
+        <w:rFonts w:ascii="Wingdings" w:hAnsi="Wingdings" w:hint="default"/>
+        <w:sz w:val="20"/>
+      </w:rPr>
+    </w:lvl>
+    <w:lvl w:ilvl="7" w:tentative="1">
+      <w:start w:val="1"/>
+      <w:numFmt w:val="bullet"/>
+      <w:lvlText w:val=""/>
+      <w:lvlJc w:val="left"/>
+      <w:pPr>
+        <w:tabs>
+          <w:tab w:val="num" w:pos="5760"/>
+        </w:tabs>
+        <w:ind w:left="5760" w:hanging="360"/>
+      </w:pPr>
+      <w:rPr>
+        <w:rFonts w:ascii="Wingdings" w:hAnsi="Wingdings" w:hint="default"/>
+        <w:sz w:val="20"/>
+      </w:rPr>
+    </w:lvl>
+    <w:lvl w:ilvl="8" w:tentative="1">
+      <w:start w:val="1"/>
+      <w:numFmt w:val="bullet"/>
+      <w:lvlText w:val=""/>
+      <w:lvlJc w:val="left"/>
+      <w:pPr>
+        <w:tabs>
+          <w:tab w:val="num" w:pos="6480"/>
+        </w:tabs>
+        <w:ind w:left="6480" w:hanging="360"/>
+      </w:pPr>
+      <w:rPr>
+        <w:rFonts w:ascii="Wingdings" w:hAnsi="Wingdings" w:hint="default"/>
+        <w:sz w:val="20"/>
+      </w:rPr>
+    </w:lvl>
+  </w:abstractNum>
+  <w:abstractNum w:abstractNumId="23" w15:restartNumberingAfterBreak="0">
     <w:nsid w:val="3DA65AD6"/>
     <w:multiLevelType w:val="multilevel"/>
     <w:tmpl w:val="134498E2"/>
@@ -3708,7 +5085,603 @@
       </w:rPr>
     </w:lvl>
   </w:abstractNum>
-  <w:abstractNum w:abstractNumId="15" w15:restartNumberingAfterBreak="0">
+  <w:abstractNum w:abstractNumId="24" w15:restartNumberingAfterBreak="0">
+    <w:nsid w:val="3E0D3A8E"/>
+    <w:multiLevelType w:val="multilevel"/>
+    <w:tmpl w:val="588C8CEE"/>
+    <w:lvl w:ilvl="0">
+      <w:start w:val="1"/>
+      <w:numFmt w:val="bullet"/>
+      <w:lvlText w:val=""/>
+      <w:lvlJc w:val="left"/>
+      <w:pPr>
+        <w:tabs>
+          <w:tab w:val="num" w:pos="720"/>
+        </w:tabs>
+        <w:ind w:left="720" w:hanging="360"/>
+      </w:pPr>
+      <w:rPr>
+        <w:rFonts w:ascii="Symbol" w:hAnsi="Symbol" w:hint="default"/>
+        <w:sz w:val="20"/>
+      </w:rPr>
+    </w:lvl>
+    <w:lvl w:ilvl="1" w:tentative="1">
+      <w:start w:val="1"/>
+      <w:numFmt w:val="bullet"/>
+      <w:lvlText w:val="o"/>
+      <w:lvlJc w:val="left"/>
+      <w:pPr>
+        <w:tabs>
+          <w:tab w:val="num" w:pos="1440"/>
+        </w:tabs>
+        <w:ind w:left="1440" w:hanging="360"/>
+      </w:pPr>
+      <w:rPr>
+        <w:rFonts w:ascii="Courier New" w:hAnsi="Courier New" w:hint="default"/>
+        <w:sz w:val="20"/>
+      </w:rPr>
+    </w:lvl>
+    <w:lvl w:ilvl="2" w:tentative="1">
+      <w:start w:val="1"/>
+      <w:numFmt w:val="bullet"/>
+      <w:lvlText w:val=""/>
+      <w:lvlJc w:val="left"/>
+      <w:pPr>
+        <w:tabs>
+          <w:tab w:val="num" w:pos="2160"/>
+        </w:tabs>
+        <w:ind w:left="2160" w:hanging="360"/>
+      </w:pPr>
+      <w:rPr>
+        <w:rFonts w:ascii="Wingdings" w:hAnsi="Wingdings" w:hint="default"/>
+        <w:sz w:val="20"/>
+      </w:rPr>
+    </w:lvl>
+    <w:lvl w:ilvl="3" w:tentative="1">
+      <w:start w:val="1"/>
+      <w:numFmt w:val="bullet"/>
+      <w:lvlText w:val=""/>
+      <w:lvlJc w:val="left"/>
+      <w:pPr>
+        <w:tabs>
+          <w:tab w:val="num" w:pos="2880"/>
+        </w:tabs>
+        <w:ind w:left="2880" w:hanging="360"/>
+      </w:pPr>
+      <w:rPr>
+        <w:rFonts w:ascii="Wingdings" w:hAnsi="Wingdings" w:hint="default"/>
+        <w:sz w:val="20"/>
+      </w:rPr>
+    </w:lvl>
+    <w:lvl w:ilvl="4" w:tentative="1">
+      <w:start w:val="1"/>
+      <w:numFmt w:val="bullet"/>
+      <w:lvlText w:val=""/>
+      <w:lvlJc w:val="left"/>
+      <w:pPr>
+        <w:tabs>
+          <w:tab w:val="num" w:pos="3600"/>
+        </w:tabs>
+        <w:ind w:left="3600" w:hanging="360"/>
+      </w:pPr>
+      <w:rPr>
+        <w:rFonts w:ascii="Wingdings" w:hAnsi="Wingdings" w:hint="default"/>
+        <w:sz w:val="20"/>
+      </w:rPr>
+    </w:lvl>
+    <w:lvl w:ilvl="5" w:tentative="1">
+      <w:start w:val="1"/>
+      <w:numFmt w:val="bullet"/>
+      <w:lvlText w:val=""/>
+      <w:lvlJc w:val="left"/>
+      <w:pPr>
+        <w:tabs>
+          <w:tab w:val="num" w:pos="4320"/>
+        </w:tabs>
+        <w:ind w:left="4320" w:hanging="360"/>
+      </w:pPr>
+      <w:rPr>
+        <w:rFonts w:ascii="Wingdings" w:hAnsi="Wingdings" w:hint="default"/>
+        <w:sz w:val="20"/>
+      </w:rPr>
+    </w:lvl>
+    <w:lvl w:ilvl="6" w:tentative="1">
+      <w:start w:val="1"/>
+      <w:numFmt w:val="bullet"/>
+      <w:lvlText w:val=""/>
+      <w:lvlJc w:val="left"/>
+      <w:pPr>
+        <w:tabs>
+          <w:tab w:val="num" w:pos="5040"/>
+        </w:tabs>
+        <w:ind w:left="5040" w:hanging="360"/>
+      </w:pPr>
+      <w:rPr>
+        <w:rFonts w:ascii="Wingdings" w:hAnsi="Wingdings" w:hint="default"/>
+        <w:sz w:val="20"/>
+      </w:rPr>
+    </w:lvl>
+    <w:lvl w:ilvl="7" w:tentative="1">
+      <w:start w:val="1"/>
+      <w:numFmt w:val="bullet"/>
+      <w:lvlText w:val=""/>
+      <w:lvlJc w:val="left"/>
+      <w:pPr>
+        <w:tabs>
+          <w:tab w:val="num" w:pos="5760"/>
+        </w:tabs>
+        <w:ind w:left="5760" w:hanging="360"/>
+      </w:pPr>
+      <w:rPr>
+        <w:rFonts w:ascii="Wingdings" w:hAnsi="Wingdings" w:hint="default"/>
+        <w:sz w:val="20"/>
+      </w:rPr>
+    </w:lvl>
+    <w:lvl w:ilvl="8" w:tentative="1">
+      <w:start w:val="1"/>
+      <w:numFmt w:val="bullet"/>
+      <w:lvlText w:val=""/>
+      <w:lvlJc w:val="left"/>
+      <w:pPr>
+        <w:tabs>
+          <w:tab w:val="num" w:pos="6480"/>
+        </w:tabs>
+        <w:ind w:left="6480" w:hanging="360"/>
+      </w:pPr>
+      <w:rPr>
+        <w:rFonts w:ascii="Wingdings" w:hAnsi="Wingdings" w:hint="default"/>
+        <w:sz w:val="20"/>
+      </w:rPr>
+    </w:lvl>
+  </w:abstractNum>
+  <w:abstractNum w:abstractNumId="25" w15:restartNumberingAfterBreak="0">
+    <w:nsid w:val="44BB7802"/>
+    <w:multiLevelType w:val="multilevel"/>
+    <w:tmpl w:val="7840C524"/>
+    <w:lvl w:ilvl="0">
+      <w:start w:val="1"/>
+      <w:numFmt w:val="bullet"/>
+      <w:lvlText w:val=""/>
+      <w:lvlJc w:val="left"/>
+      <w:pPr>
+        <w:tabs>
+          <w:tab w:val="num" w:pos="720"/>
+        </w:tabs>
+        <w:ind w:left="720" w:hanging="360"/>
+      </w:pPr>
+      <w:rPr>
+        <w:rFonts w:ascii="Symbol" w:hAnsi="Symbol" w:hint="default"/>
+        <w:sz w:val="20"/>
+      </w:rPr>
+    </w:lvl>
+    <w:lvl w:ilvl="1" w:tentative="1">
+      <w:start w:val="1"/>
+      <w:numFmt w:val="bullet"/>
+      <w:lvlText w:val="o"/>
+      <w:lvlJc w:val="left"/>
+      <w:pPr>
+        <w:tabs>
+          <w:tab w:val="num" w:pos="1440"/>
+        </w:tabs>
+        <w:ind w:left="1440" w:hanging="360"/>
+      </w:pPr>
+      <w:rPr>
+        <w:rFonts w:ascii="Courier New" w:hAnsi="Courier New" w:hint="default"/>
+        <w:sz w:val="20"/>
+      </w:rPr>
+    </w:lvl>
+    <w:lvl w:ilvl="2" w:tentative="1">
+      <w:start w:val="1"/>
+      <w:numFmt w:val="bullet"/>
+      <w:lvlText w:val=""/>
+      <w:lvlJc w:val="left"/>
+      <w:pPr>
+        <w:tabs>
+          <w:tab w:val="num" w:pos="2160"/>
+        </w:tabs>
+        <w:ind w:left="2160" w:hanging="360"/>
+      </w:pPr>
+      <w:rPr>
+        <w:rFonts w:ascii="Wingdings" w:hAnsi="Wingdings" w:hint="default"/>
+        <w:sz w:val="20"/>
+      </w:rPr>
+    </w:lvl>
+    <w:lvl w:ilvl="3" w:tentative="1">
+      <w:start w:val="1"/>
+      <w:numFmt w:val="bullet"/>
+      <w:lvlText w:val=""/>
+      <w:lvlJc w:val="left"/>
+      <w:pPr>
+        <w:tabs>
+          <w:tab w:val="num" w:pos="2880"/>
+        </w:tabs>
+        <w:ind w:left="2880" w:hanging="360"/>
+      </w:pPr>
+      <w:rPr>
+        <w:rFonts w:ascii="Wingdings" w:hAnsi="Wingdings" w:hint="default"/>
+        <w:sz w:val="20"/>
+      </w:rPr>
+    </w:lvl>
+    <w:lvl w:ilvl="4" w:tentative="1">
+      <w:start w:val="1"/>
+      <w:numFmt w:val="bullet"/>
+      <w:lvlText w:val=""/>
+      <w:lvlJc w:val="left"/>
+      <w:pPr>
+        <w:tabs>
+          <w:tab w:val="num" w:pos="3600"/>
+        </w:tabs>
+        <w:ind w:left="3600" w:hanging="360"/>
+      </w:pPr>
+      <w:rPr>
+        <w:rFonts w:ascii="Wingdings" w:hAnsi="Wingdings" w:hint="default"/>
+        <w:sz w:val="20"/>
+      </w:rPr>
+    </w:lvl>
+    <w:lvl w:ilvl="5" w:tentative="1">
+      <w:start w:val="1"/>
+      <w:numFmt w:val="bullet"/>
+      <w:lvlText w:val=""/>
+      <w:lvlJc w:val="left"/>
+      <w:pPr>
+        <w:tabs>
+          <w:tab w:val="num" w:pos="4320"/>
+        </w:tabs>
+        <w:ind w:left="4320" w:hanging="360"/>
+      </w:pPr>
+      <w:rPr>
+        <w:rFonts w:ascii="Wingdings" w:hAnsi="Wingdings" w:hint="default"/>
+        <w:sz w:val="20"/>
+      </w:rPr>
+    </w:lvl>
+    <w:lvl w:ilvl="6" w:tentative="1">
+      <w:start w:val="1"/>
+      <w:numFmt w:val="bullet"/>
+      <w:lvlText w:val=""/>
+      <w:lvlJc w:val="left"/>
+      <w:pPr>
+        <w:tabs>
+          <w:tab w:val="num" w:pos="5040"/>
+        </w:tabs>
+        <w:ind w:left="5040" w:hanging="360"/>
+      </w:pPr>
+      <w:rPr>
+        <w:rFonts w:ascii="Wingdings" w:hAnsi="Wingdings" w:hint="default"/>
+        <w:sz w:val="20"/>
+      </w:rPr>
+    </w:lvl>
+    <w:lvl w:ilvl="7" w:tentative="1">
+      <w:start w:val="1"/>
+      <w:numFmt w:val="bullet"/>
+      <w:lvlText w:val=""/>
+      <w:lvlJc w:val="left"/>
+      <w:pPr>
+        <w:tabs>
+          <w:tab w:val="num" w:pos="5760"/>
+        </w:tabs>
+        <w:ind w:left="5760" w:hanging="360"/>
+      </w:pPr>
+      <w:rPr>
+        <w:rFonts w:ascii="Wingdings" w:hAnsi="Wingdings" w:hint="default"/>
+        <w:sz w:val="20"/>
+      </w:rPr>
+    </w:lvl>
+    <w:lvl w:ilvl="8" w:tentative="1">
+      <w:start w:val="1"/>
+      <w:numFmt w:val="bullet"/>
+      <w:lvlText w:val=""/>
+      <w:lvlJc w:val="left"/>
+      <w:pPr>
+        <w:tabs>
+          <w:tab w:val="num" w:pos="6480"/>
+        </w:tabs>
+        <w:ind w:left="6480" w:hanging="360"/>
+      </w:pPr>
+      <w:rPr>
+        <w:rFonts w:ascii="Wingdings" w:hAnsi="Wingdings" w:hint="default"/>
+        <w:sz w:val="20"/>
+      </w:rPr>
+    </w:lvl>
+  </w:abstractNum>
+  <w:abstractNum w:abstractNumId="26" w15:restartNumberingAfterBreak="0">
+    <w:nsid w:val="45337DCF"/>
+    <w:multiLevelType w:val="multilevel"/>
+    <w:tmpl w:val="79AAFA92"/>
+    <w:lvl w:ilvl="0">
+      <w:start w:val="1"/>
+      <w:numFmt w:val="bullet"/>
+      <w:lvlText w:val=""/>
+      <w:lvlJc w:val="left"/>
+      <w:pPr>
+        <w:tabs>
+          <w:tab w:val="num" w:pos="720"/>
+        </w:tabs>
+        <w:ind w:left="720" w:hanging="360"/>
+      </w:pPr>
+      <w:rPr>
+        <w:rFonts w:ascii="Symbol" w:hAnsi="Symbol" w:hint="default"/>
+        <w:sz w:val="20"/>
+      </w:rPr>
+    </w:lvl>
+    <w:lvl w:ilvl="1" w:tentative="1">
+      <w:start w:val="1"/>
+      <w:numFmt w:val="bullet"/>
+      <w:lvlText w:val="o"/>
+      <w:lvlJc w:val="left"/>
+      <w:pPr>
+        <w:tabs>
+          <w:tab w:val="num" w:pos="1440"/>
+        </w:tabs>
+        <w:ind w:left="1440" w:hanging="360"/>
+      </w:pPr>
+      <w:rPr>
+        <w:rFonts w:ascii="Courier New" w:hAnsi="Courier New" w:hint="default"/>
+        <w:sz w:val="20"/>
+      </w:rPr>
+    </w:lvl>
+    <w:lvl w:ilvl="2" w:tentative="1">
+      <w:start w:val="1"/>
+      <w:numFmt w:val="bullet"/>
+      <w:lvlText w:val=""/>
+      <w:lvlJc w:val="left"/>
+      <w:pPr>
+        <w:tabs>
+          <w:tab w:val="num" w:pos="2160"/>
+        </w:tabs>
+        <w:ind w:left="2160" w:hanging="360"/>
+      </w:pPr>
+      <w:rPr>
+        <w:rFonts w:ascii="Wingdings" w:hAnsi="Wingdings" w:hint="default"/>
+        <w:sz w:val="20"/>
+      </w:rPr>
+    </w:lvl>
+    <w:lvl w:ilvl="3" w:tentative="1">
+      <w:start w:val="1"/>
+      <w:numFmt w:val="bullet"/>
+      <w:lvlText w:val=""/>
+      <w:lvlJc w:val="left"/>
+      <w:pPr>
+        <w:tabs>
+          <w:tab w:val="num" w:pos="2880"/>
+        </w:tabs>
+        <w:ind w:left="2880" w:hanging="360"/>
+      </w:pPr>
+      <w:rPr>
+        <w:rFonts w:ascii="Wingdings" w:hAnsi="Wingdings" w:hint="default"/>
+        <w:sz w:val="20"/>
+      </w:rPr>
+    </w:lvl>
+    <w:lvl w:ilvl="4" w:tentative="1">
+      <w:start w:val="1"/>
+      <w:numFmt w:val="bullet"/>
+      <w:lvlText w:val=""/>
+      <w:lvlJc w:val="left"/>
+      <w:pPr>
+        <w:tabs>
+          <w:tab w:val="num" w:pos="3600"/>
+        </w:tabs>
+        <w:ind w:left="3600" w:hanging="360"/>
+      </w:pPr>
+      <w:rPr>
+        <w:rFonts w:ascii="Wingdings" w:hAnsi="Wingdings" w:hint="default"/>
+        <w:sz w:val="20"/>
+      </w:rPr>
+    </w:lvl>
+    <w:lvl w:ilvl="5" w:tentative="1">
+      <w:start w:val="1"/>
+      <w:numFmt w:val="bullet"/>
+      <w:lvlText w:val=""/>
+      <w:lvlJc w:val="left"/>
+      <w:pPr>
+        <w:tabs>
+          <w:tab w:val="num" w:pos="4320"/>
+        </w:tabs>
+        <w:ind w:left="4320" w:hanging="360"/>
+      </w:pPr>
+      <w:rPr>
+        <w:rFonts w:ascii="Wingdings" w:hAnsi="Wingdings" w:hint="default"/>
+        <w:sz w:val="20"/>
+      </w:rPr>
+    </w:lvl>
+    <w:lvl w:ilvl="6" w:tentative="1">
+      <w:start w:val="1"/>
+      <w:numFmt w:val="bullet"/>
+      <w:lvlText w:val=""/>
+      <w:lvlJc w:val="left"/>
+      <w:pPr>
+        <w:tabs>
+          <w:tab w:val="num" w:pos="5040"/>
+        </w:tabs>
+        <w:ind w:left="5040" w:hanging="360"/>
+      </w:pPr>
+      <w:rPr>
+        <w:rFonts w:ascii="Wingdings" w:hAnsi="Wingdings" w:hint="default"/>
+        <w:sz w:val="20"/>
+      </w:rPr>
+    </w:lvl>
+    <w:lvl w:ilvl="7" w:tentative="1">
+      <w:start w:val="1"/>
+      <w:numFmt w:val="bullet"/>
+      <w:lvlText w:val=""/>
+      <w:lvlJc w:val="left"/>
+      <w:pPr>
+        <w:tabs>
+          <w:tab w:val="num" w:pos="5760"/>
+        </w:tabs>
+        <w:ind w:left="5760" w:hanging="360"/>
+      </w:pPr>
+      <w:rPr>
+        <w:rFonts w:ascii="Wingdings" w:hAnsi="Wingdings" w:hint="default"/>
+        <w:sz w:val="20"/>
+      </w:rPr>
+    </w:lvl>
+    <w:lvl w:ilvl="8" w:tentative="1">
+      <w:start w:val="1"/>
+      <w:numFmt w:val="bullet"/>
+      <w:lvlText w:val=""/>
+      <w:lvlJc w:val="left"/>
+      <w:pPr>
+        <w:tabs>
+          <w:tab w:val="num" w:pos="6480"/>
+        </w:tabs>
+        <w:ind w:left="6480" w:hanging="360"/>
+      </w:pPr>
+      <w:rPr>
+        <w:rFonts w:ascii="Wingdings" w:hAnsi="Wingdings" w:hint="default"/>
+        <w:sz w:val="20"/>
+      </w:rPr>
+    </w:lvl>
+  </w:abstractNum>
+  <w:abstractNum w:abstractNumId="27" w15:restartNumberingAfterBreak="0">
+    <w:nsid w:val="49767A1E"/>
+    <w:multiLevelType w:val="multilevel"/>
+    <w:tmpl w:val="42369958"/>
+    <w:lvl w:ilvl="0">
+      <w:start w:val="1"/>
+      <w:numFmt w:val="bullet"/>
+      <w:lvlText w:val=""/>
+      <w:lvlJc w:val="left"/>
+      <w:pPr>
+        <w:tabs>
+          <w:tab w:val="num" w:pos="720"/>
+        </w:tabs>
+        <w:ind w:left="720" w:hanging="360"/>
+      </w:pPr>
+      <w:rPr>
+        <w:rFonts w:ascii="Symbol" w:hAnsi="Symbol" w:hint="default"/>
+        <w:sz w:val="20"/>
+      </w:rPr>
+    </w:lvl>
+    <w:lvl w:ilvl="1" w:tentative="1">
+      <w:start w:val="1"/>
+      <w:numFmt w:val="bullet"/>
+      <w:lvlText w:val="o"/>
+      <w:lvlJc w:val="left"/>
+      <w:pPr>
+        <w:tabs>
+          <w:tab w:val="num" w:pos="1440"/>
+        </w:tabs>
+        <w:ind w:left="1440" w:hanging="360"/>
+      </w:pPr>
+      <w:rPr>
+        <w:rFonts w:ascii="Courier New" w:hAnsi="Courier New" w:hint="default"/>
+        <w:sz w:val="20"/>
+      </w:rPr>
+    </w:lvl>
+    <w:lvl w:ilvl="2" w:tentative="1">
+      <w:start w:val="1"/>
+      <w:numFmt w:val="bullet"/>
+      <w:lvlText w:val=""/>
+      <w:lvlJc w:val="left"/>
+      <w:pPr>
+        <w:tabs>
+          <w:tab w:val="num" w:pos="2160"/>
+        </w:tabs>
+        <w:ind w:left="2160" w:hanging="360"/>
+      </w:pPr>
+      <w:rPr>
+        <w:rFonts w:ascii="Wingdings" w:hAnsi="Wingdings" w:hint="default"/>
+        <w:sz w:val="20"/>
+      </w:rPr>
+    </w:lvl>
+    <w:lvl w:ilvl="3" w:tentative="1">
+      <w:start w:val="1"/>
+      <w:numFmt w:val="bullet"/>
+      <w:lvlText w:val=""/>
+      <w:lvlJc w:val="left"/>
+      <w:pPr>
+        <w:tabs>
+          <w:tab w:val="num" w:pos="2880"/>
+        </w:tabs>
+        <w:ind w:left="2880" w:hanging="360"/>
+      </w:pPr>
+      <w:rPr>
+        <w:rFonts w:ascii="Wingdings" w:hAnsi="Wingdings" w:hint="default"/>
+        <w:sz w:val="20"/>
+      </w:rPr>
+    </w:lvl>
+    <w:lvl w:ilvl="4" w:tentative="1">
+      <w:start w:val="1"/>
+      <w:numFmt w:val="bullet"/>
+      <w:lvlText w:val=""/>
+      <w:lvlJc w:val="left"/>
+      <w:pPr>
+        <w:tabs>
+          <w:tab w:val="num" w:pos="3600"/>
+        </w:tabs>
+        <w:ind w:left="3600" w:hanging="360"/>
+      </w:pPr>
+      <w:rPr>
+        <w:rFonts w:ascii="Wingdings" w:hAnsi="Wingdings" w:hint="default"/>
+        <w:sz w:val="20"/>
+      </w:rPr>
+    </w:lvl>
+    <w:lvl w:ilvl="5" w:tentative="1">
+      <w:start w:val="1"/>
+      <w:numFmt w:val="bullet"/>
+      <w:lvlText w:val=""/>
+      <w:lvlJc w:val="left"/>
+      <w:pPr>
+        <w:tabs>
+          <w:tab w:val="num" w:pos="4320"/>
+        </w:tabs>
+        <w:ind w:left="4320" w:hanging="360"/>
+      </w:pPr>
+      <w:rPr>
+        <w:rFonts w:ascii="Wingdings" w:hAnsi="Wingdings" w:hint="default"/>
+        <w:sz w:val="20"/>
+      </w:rPr>
+    </w:lvl>
+    <w:lvl w:ilvl="6" w:tentative="1">
+      <w:start w:val="1"/>
+      <w:numFmt w:val="bullet"/>
+      <w:lvlText w:val=""/>
+      <w:lvlJc w:val="left"/>
+      <w:pPr>
+        <w:tabs>
+          <w:tab w:val="num" w:pos="5040"/>
+        </w:tabs>
+        <w:ind w:left="5040" w:hanging="360"/>
+      </w:pPr>
+      <w:rPr>
+        <w:rFonts w:ascii="Wingdings" w:hAnsi="Wingdings" w:hint="default"/>
+        <w:sz w:val="20"/>
+      </w:rPr>
+    </w:lvl>
+    <w:lvl w:ilvl="7" w:tentative="1">
+      <w:start w:val="1"/>
+      <w:numFmt w:val="bullet"/>
+      <w:lvlText w:val=""/>
+      <w:lvlJc w:val="left"/>
+      <w:pPr>
+        <w:tabs>
+          <w:tab w:val="num" w:pos="5760"/>
+        </w:tabs>
+        <w:ind w:left="5760" w:hanging="360"/>
+      </w:pPr>
+      <w:rPr>
+        <w:rFonts w:ascii="Wingdings" w:hAnsi="Wingdings" w:hint="default"/>
+        <w:sz w:val="20"/>
+      </w:rPr>
+    </w:lvl>
+    <w:lvl w:ilvl="8" w:tentative="1">
+      <w:start w:val="1"/>
+      <w:numFmt w:val="bullet"/>
+      <w:lvlText w:val=""/>
+      <w:lvlJc w:val="left"/>
+      <w:pPr>
+        <w:tabs>
+          <w:tab w:val="num" w:pos="6480"/>
+        </w:tabs>
+        <w:ind w:left="6480" w:hanging="360"/>
+      </w:pPr>
+      <w:rPr>
+        <w:rFonts w:ascii="Wingdings" w:hAnsi="Wingdings" w:hint="default"/>
+        <w:sz w:val="20"/>
+      </w:rPr>
+    </w:lvl>
+  </w:abstractNum>
+  <w:abstractNum w:abstractNumId="28" w15:restartNumberingAfterBreak="0">
     <w:nsid w:val="50E52DCD"/>
     <w:multiLevelType w:val="multilevel"/>
     <w:tmpl w:val="B87CDDB4"/>
@@ -3857,7 +5830,7 @@
       </w:rPr>
     </w:lvl>
   </w:abstractNum>
-  <w:abstractNum w:abstractNumId="16" w15:restartNumberingAfterBreak="0">
+  <w:abstractNum w:abstractNumId="29" w15:restartNumberingAfterBreak="0">
     <w:nsid w:val="55AE3BE8"/>
     <w:multiLevelType w:val="multilevel"/>
     <w:tmpl w:val="DC985E40"/>
@@ -4006,7 +5979,7 @@
       </w:rPr>
     </w:lvl>
   </w:abstractNum>
-  <w:abstractNum w:abstractNumId="17" w15:restartNumberingAfterBreak="0">
+  <w:abstractNum w:abstractNumId="30" w15:restartNumberingAfterBreak="0">
     <w:nsid w:val="5B1C7CBC"/>
     <w:multiLevelType w:val="multilevel"/>
     <w:tmpl w:val="1F66DA34"/>
@@ -4155,7 +6128,7 @@
       </w:rPr>
     </w:lvl>
   </w:abstractNum>
-  <w:abstractNum w:abstractNumId="18" w15:restartNumberingAfterBreak="0">
+  <w:abstractNum w:abstractNumId="31" w15:restartNumberingAfterBreak="0">
     <w:nsid w:val="5B6E5509"/>
     <w:multiLevelType w:val="multilevel"/>
     <w:tmpl w:val="F0BCF2A0"/>
@@ -4304,7 +6277,156 @@
       </w:rPr>
     </w:lvl>
   </w:abstractNum>
-  <w:abstractNum w:abstractNumId="19" w15:restartNumberingAfterBreak="0">
+  <w:abstractNum w:abstractNumId="32" w15:restartNumberingAfterBreak="0">
+    <w:nsid w:val="5E4F4361"/>
+    <w:multiLevelType w:val="multilevel"/>
+    <w:tmpl w:val="26A4BF2E"/>
+    <w:lvl w:ilvl="0">
+      <w:start w:val="1"/>
+      <w:numFmt w:val="bullet"/>
+      <w:lvlText w:val=""/>
+      <w:lvlJc w:val="left"/>
+      <w:pPr>
+        <w:tabs>
+          <w:tab w:val="num" w:pos="720"/>
+        </w:tabs>
+        <w:ind w:left="720" w:hanging="360"/>
+      </w:pPr>
+      <w:rPr>
+        <w:rFonts w:ascii="Symbol" w:hAnsi="Symbol" w:hint="default"/>
+        <w:sz w:val="20"/>
+      </w:rPr>
+    </w:lvl>
+    <w:lvl w:ilvl="1" w:tentative="1">
+      <w:start w:val="1"/>
+      <w:numFmt w:val="bullet"/>
+      <w:lvlText w:val="o"/>
+      <w:lvlJc w:val="left"/>
+      <w:pPr>
+        <w:tabs>
+          <w:tab w:val="num" w:pos="1440"/>
+        </w:tabs>
+        <w:ind w:left="1440" w:hanging="360"/>
+      </w:pPr>
+      <w:rPr>
+        <w:rFonts w:ascii="Courier New" w:hAnsi="Courier New" w:hint="default"/>
+        <w:sz w:val="20"/>
+      </w:rPr>
+    </w:lvl>
+    <w:lvl w:ilvl="2" w:tentative="1">
+      <w:start w:val="1"/>
+      <w:numFmt w:val="bullet"/>
+      <w:lvlText w:val=""/>
+      <w:lvlJc w:val="left"/>
+      <w:pPr>
+        <w:tabs>
+          <w:tab w:val="num" w:pos="2160"/>
+        </w:tabs>
+        <w:ind w:left="2160" w:hanging="360"/>
+      </w:pPr>
+      <w:rPr>
+        <w:rFonts w:ascii="Wingdings" w:hAnsi="Wingdings" w:hint="default"/>
+        <w:sz w:val="20"/>
+      </w:rPr>
+    </w:lvl>
+    <w:lvl w:ilvl="3" w:tentative="1">
+      <w:start w:val="1"/>
+      <w:numFmt w:val="bullet"/>
+      <w:lvlText w:val=""/>
+      <w:lvlJc w:val="left"/>
+      <w:pPr>
+        <w:tabs>
+          <w:tab w:val="num" w:pos="2880"/>
+        </w:tabs>
+        <w:ind w:left="2880" w:hanging="360"/>
+      </w:pPr>
+      <w:rPr>
+        <w:rFonts w:ascii="Wingdings" w:hAnsi="Wingdings" w:hint="default"/>
+        <w:sz w:val="20"/>
+      </w:rPr>
+    </w:lvl>
+    <w:lvl w:ilvl="4" w:tentative="1">
+      <w:start w:val="1"/>
+      <w:numFmt w:val="bullet"/>
+      <w:lvlText w:val=""/>
+      <w:lvlJc w:val="left"/>
+      <w:pPr>
+        <w:tabs>
+          <w:tab w:val="num" w:pos="3600"/>
+        </w:tabs>
+        <w:ind w:left="3600" w:hanging="360"/>
+      </w:pPr>
+      <w:rPr>
+        <w:rFonts w:ascii="Wingdings" w:hAnsi="Wingdings" w:hint="default"/>
+        <w:sz w:val="20"/>
+      </w:rPr>
+    </w:lvl>
+    <w:lvl w:ilvl="5" w:tentative="1">
+      <w:start w:val="1"/>
+      <w:numFmt w:val="bullet"/>
+      <w:lvlText w:val=""/>
+      <w:lvlJc w:val="left"/>
+      <w:pPr>
+        <w:tabs>
+          <w:tab w:val="num" w:pos="4320"/>
+        </w:tabs>
+        <w:ind w:left="4320" w:hanging="360"/>
+      </w:pPr>
+      <w:rPr>
+        <w:rFonts w:ascii="Wingdings" w:hAnsi="Wingdings" w:hint="default"/>
+        <w:sz w:val="20"/>
+      </w:rPr>
+    </w:lvl>
+    <w:lvl w:ilvl="6" w:tentative="1">
+      <w:start w:val="1"/>
+      <w:numFmt w:val="bullet"/>
+      <w:lvlText w:val=""/>
+      <w:lvlJc w:val="left"/>
+      <w:pPr>
+        <w:tabs>
+          <w:tab w:val="num" w:pos="5040"/>
+        </w:tabs>
+        <w:ind w:left="5040" w:hanging="360"/>
+      </w:pPr>
+      <w:rPr>
+        <w:rFonts w:ascii="Wingdings" w:hAnsi="Wingdings" w:hint="default"/>
+        <w:sz w:val="20"/>
+      </w:rPr>
+    </w:lvl>
+    <w:lvl w:ilvl="7" w:tentative="1">
+      <w:start w:val="1"/>
+      <w:numFmt w:val="bullet"/>
+      <w:lvlText w:val=""/>
+      <w:lvlJc w:val="left"/>
+      <w:pPr>
+        <w:tabs>
+          <w:tab w:val="num" w:pos="5760"/>
+        </w:tabs>
+        <w:ind w:left="5760" w:hanging="360"/>
+      </w:pPr>
+      <w:rPr>
+        <w:rFonts w:ascii="Wingdings" w:hAnsi="Wingdings" w:hint="default"/>
+        <w:sz w:val="20"/>
+      </w:rPr>
+    </w:lvl>
+    <w:lvl w:ilvl="8" w:tentative="1">
+      <w:start w:val="1"/>
+      <w:numFmt w:val="bullet"/>
+      <w:lvlText w:val=""/>
+      <w:lvlJc w:val="left"/>
+      <w:pPr>
+        <w:tabs>
+          <w:tab w:val="num" w:pos="6480"/>
+        </w:tabs>
+        <w:ind w:left="6480" w:hanging="360"/>
+      </w:pPr>
+      <w:rPr>
+        <w:rFonts w:ascii="Wingdings" w:hAnsi="Wingdings" w:hint="default"/>
+        <w:sz w:val="20"/>
+      </w:rPr>
+    </w:lvl>
+  </w:abstractNum>
+  <w:abstractNum w:abstractNumId="33" w15:restartNumberingAfterBreak="0">
     <w:nsid w:val="624F3119"/>
     <w:multiLevelType w:val="multilevel"/>
     <w:tmpl w:val="AFF60086"/>
@@ -4453,7 +6575,7 @@
       </w:rPr>
     </w:lvl>
   </w:abstractNum>
-  <w:abstractNum w:abstractNumId="20" w15:restartNumberingAfterBreak="0">
+  <w:abstractNum w:abstractNumId="34" w15:restartNumberingAfterBreak="0">
     <w:nsid w:val="668D6C61"/>
     <w:multiLevelType w:val="multilevel"/>
     <w:tmpl w:val="3F24B5D8"/>
@@ -4602,7 +6724,156 @@
       </w:rPr>
     </w:lvl>
   </w:abstractNum>
-  <w:abstractNum w:abstractNumId="21" w15:restartNumberingAfterBreak="0">
+  <w:abstractNum w:abstractNumId="35" w15:restartNumberingAfterBreak="0">
+    <w:nsid w:val="68816C55"/>
+    <w:multiLevelType w:val="multilevel"/>
+    <w:tmpl w:val="9CE82106"/>
+    <w:lvl w:ilvl="0">
+      <w:start w:val="1"/>
+      <w:numFmt w:val="bullet"/>
+      <w:lvlText w:val=""/>
+      <w:lvlJc w:val="left"/>
+      <w:pPr>
+        <w:tabs>
+          <w:tab w:val="num" w:pos="720"/>
+        </w:tabs>
+        <w:ind w:left="720" w:hanging="360"/>
+      </w:pPr>
+      <w:rPr>
+        <w:rFonts w:ascii="Symbol" w:hAnsi="Symbol" w:hint="default"/>
+        <w:sz w:val="20"/>
+      </w:rPr>
+    </w:lvl>
+    <w:lvl w:ilvl="1" w:tentative="1">
+      <w:start w:val="1"/>
+      <w:numFmt w:val="bullet"/>
+      <w:lvlText w:val="o"/>
+      <w:lvlJc w:val="left"/>
+      <w:pPr>
+        <w:tabs>
+          <w:tab w:val="num" w:pos="1440"/>
+        </w:tabs>
+        <w:ind w:left="1440" w:hanging="360"/>
+      </w:pPr>
+      <w:rPr>
+        <w:rFonts w:ascii="Courier New" w:hAnsi="Courier New" w:hint="default"/>
+        <w:sz w:val="20"/>
+      </w:rPr>
+    </w:lvl>
+    <w:lvl w:ilvl="2" w:tentative="1">
+      <w:start w:val="1"/>
+      <w:numFmt w:val="bullet"/>
+      <w:lvlText w:val=""/>
+      <w:lvlJc w:val="left"/>
+      <w:pPr>
+        <w:tabs>
+          <w:tab w:val="num" w:pos="2160"/>
+        </w:tabs>
+        <w:ind w:left="2160" w:hanging="360"/>
+      </w:pPr>
+      <w:rPr>
+        <w:rFonts w:ascii="Wingdings" w:hAnsi="Wingdings" w:hint="default"/>
+        <w:sz w:val="20"/>
+      </w:rPr>
+    </w:lvl>
+    <w:lvl w:ilvl="3" w:tentative="1">
+      <w:start w:val="1"/>
+      <w:numFmt w:val="bullet"/>
+      <w:lvlText w:val=""/>
+      <w:lvlJc w:val="left"/>
+      <w:pPr>
+        <w:tabs>
+          <w:tab w:val="num" w:pos="2880"/>
+        </w:tabs>
+        <w:ind w:left="2880" w:hanging="360"/>
+      </w:pPr>
+      <w:rPr>
+        <w:rFonts w:ascii="Wingdings" w:hAnsi="Wingdings" w:hint="default"/>
+        <w:sz w:val="20"/>
+      </w:rPr>
+    </w:lvl>
+    <w:lvl w:ilvl="4" w:tentative="1">
+      <w:start w:val="1"/>
+      <w:numFmt w:val="bullet"/>
+      <w:lvlText w:val=""/>
+      <w:lvlJc w:val="left"/>
+      <w:pPr>
+        <w:tabs>
+          <w:tab w:val="num" w:pos="3600"/>
+        </w:tabs>
+        <w:ind w:left="3600" w:hanging="360"/>
+      </w:pPr>
+      <w:rPr>
+        <w:rFonts w:ascii="Wingdings" w:hAnsi="Wingdings" w:hint="default"/>
+        <w:sz w:val="20"/>
+      </w:rPr>
+    </w:lvl>
+    <w:lvl w:ilvl="5" w:tentative="1">
+      <w:start w:val="1"/>
+      <w:numFmt w:val="bullet"/>
+      <w:lvlText w:val=""/>
+      <w:lvlJc w:val="left"/>
+      <w:pPr>
+        <w:tabs>
+          <w:tab w:val="num" w:pos="4320"/>
+        </w:tabs>
+        <w:ind w:left="4320" w:hanging="360"/>
+      </w:pPr>
+      <w:rPr>
+        <w:rFonts w:ascii="Wingdings" w:hAnsi="Wingdings" w:hint="default"/>
+        <w:sz w:val="20"/>
+      </w:rPr>
+    </w:lvl>
+    <w:lvl w:ilvl="6" w:tentative="1">
+      <w:start w:val="1"/>
+      <w:numFmt w:val="bullet"/>
+      <w:lvlText w:val=""/>
+      <w:lvlJc w:val="left"/>
+      <w:pPr>
+        <w:tabs>
+          <w:tab w:val="num" w:pos="5040"/>
+        </w:tabs>
+        <w:ind w:left="5040" w:hanging="360"/>
+      </w:pPr>
+      <w:rPr>
+        <w:rFonts w:ascii="Wingdings" w:hAnsi="Wingdings" w:hint="default"/>
+        <w:sz w:val="20"/>
+      </w:rPr>
+    </w:lvl>
+    <w:lvl w:ilvl="7" w:tentative="1">
+      <w:start w:val="1"/>
+      <w:numFmt w:val="bullet"/>
+      <w:lvlText w:val=""/>
+      <w:lvlJc w:val="left"/>
+      <w:pPr>
+        <w:tabs>
+          <w:tab w:val="num" w:pos="5760"/>
+        </w:tabs>
+        <w:ind w:left="5760" w:hanging="360"/>
+      </w:pPr>
+      <w:rPr>
+        <w:rFonts w:ascii="Wingdings" w:hAnsi="Wingdings" w:hint="default"/>
+        <w:sz w:val="20"/>
+      </w:rPr>
+    </w:lvl>
+    <w:lvl w:ilvl="8" w:tentative="1">
+      <w:start w:val="1"/>
+      <w:numFmt w:val="bullet"/>
+      <w:lvlText w:val=""/>
+      <w:lvlJc w:val="left"/>
+      <w:pPr>
+        <w:tabs>
+          <w:tab w:val="num" w:pos="6480"/>
+        </w:tabs>
+        <w:ind w:left="6480" w:hanging="360"/>
+      </w:pPr>
+      <w:rPr>
+        <w:rFonts w:ascii="Wingdings" w:hAnsi="Wingdings" w:hint="default"/>
+        <w:sz w:val="20"/>
+      </w:rPr>
+    </w:lvl>
+  </w:abstractNum>
+  <w:abstractNum w:abstractNumId="36" w15:restartNumberingAfterBreak="0">
     <w:nsid w:val="696355B7"/>
     <w:multiLevelType w:val="multilevel"/>
     <w:tmpl w:val="21CA8AFC"/>
@@ -4751,7 +7022,7 @@
       </w:rPr>
     </w:lvl>
   </w:abstractNum>
-  <w:abstractNum w:abstractNumId="22" w15:restartNumberingAfterBreak="0">
+  <w:abstractNum w:abstractNumId="37" w15:restartNumberingAfterBreak="0">
     <w:nsid w:val="69BD4A56"/>
     <w:multiLevelType w:val="multilevel"/>
     <w:tmpl w:val="1B865E5A"/>
@@ -4900,7 +7171,7 @@
       </w:rPr>
     </w:lvl>
   </w:abstractNum>
-  <w:abstractNum w:abstractNumId="23" w15:restartNumberingAfterBreak="0">
+  <w:abstractNum w:abstractNumId="38" w15:restartNumberingAfterBreak="0">
     <w:nsid w:val="6DC02872"/>
     <w:multiLevelType w:val="multilevel"/>
     <w:tmpl w:val="96329ECA"/>
@@ -5049,7 +7320,7 @@
       </w:rPr>
     </w:lvl>
   </w:abstractNum>
-  <w:abstractNum w:abstractNumId="24" w15:restartNumberingAfterBreak="0">
+  <w:abstractNum w:abstractNumId="39" w15:restartNumberingAfterBreak="0">
     <w:nsid w:val="726B4D1A"/>
     <w:multiLevelType w:val="multilevel"/>
     <w:tmpl w:val="3300173E"/>
@@ -5198,7 +7469,7 @@
       </w:rPr>
     </w:lvl>
   </w:abstractNum>
-  <w:abstractNum w:abstractNumId="25" w15:restartNumberingAfterBreak="0">
+  <w:abstractNum w:abstractNumId="40" w15:restartNumberingAfterBreak="0">
     <w:nsid w:val="7740229D"/>
     <w:multiLevelType w:val="multilevel"/>
     <w:tmpl w:val="2C2E4B50"/>
@@ -5347,7 +7618,7 @@
       </w:rPr>
     </w:lvl>
   </w:abstractNum>
-  <w:abstractNum w:abstractNumId="26" w15:restartNumberingAfterBreak="0">
+  <w:abstractNum w:abstractNumId="41" w15:restartNumberingAfterBreak="0">
     <w:nsid w:val="77E67608"/>
     <w:multiLevelType w:val="multilevel"/>
     <w:tmpl w:val="B4941A8C"/>
@@ -5497,85 +7768,130 @@
     </w:lvl>
   </w:abstractNum>
   <w:num w:numId="1" w16cid:durableId="507717577">
-    <w:abstractNumId w:val="6"/>
+    <w:abstractNumId w:val="10"/>
   </w:num>
   <w:num w:numId="2" w16cid:durableId="1459907946">
     <w:abstractNumId w:val="2"/>
   </w:num>
   <w:num w:numId="3" w16cid:durableId="1758400381">
-    <w:abstractNumId w:val="15"/>
+    <w:abstractNumId w:val="28"/>
   </w:num>
   <w:num w:numId="4" w16cid:durableId="2006736276">
-    <w:abstractNumId w:val="24"/>
+    <w:abstractNumId w:val="39"/>
   </w:num>
   <w:num w:numId="5" w16cid:durableId="1832065062">
-    <w:abstractNumId w:val="26"/>
+    <w:abstractNumId w:val="41"/>
   </w:num>
   <w:num w:numId="6" w16cid:durableId="1457602291">
     <w:abstractNumId w:val="1"/>
   </w:num>
   <w:num w:numId="7" w16cid:durableId="1505434523">
+    <w:abstractNumId w:val="17"/>
+  </w:num>
+  <w:num w:numId="8" w16cid:durableId="1039547552">
+    <w:abstractNumId w:val="33"/>
+  </w:num>
+  <w:num w:numId="9" w16cid:durableId="630984451">
     <w:abstractNumId w:val="12"/>
   </w:num>
-  <w:num w:numId="8" w16cid:durableId="1039547552">
-    <w:abstractNumId w:val="19"/>
+  <w:num w:numId="10" w16cid:durableId="1023937672">
+    <w:abstractNumId w:val="11"/>
   </w:num>
-  <w:num w:numId="9" w16cid:durableId="630984451">
+  <w:num w:numId="11" w16cid:durableId="1822305797">
+    <w:abstractNumId w:val="15"/>
+  </w:num>
+  <w:num w:numId="12" w16cid:durableId="240019855">
+    <w:abstractNumId w:val="29"/>
+  </w:num>
+  <w:num w:numId="13" w16cid:durableId="1588925654">
+    <w:abstractNumId w:val="40"/>
+  </w:num>
+  <w:num w:numId="14" w16cid:durableId="723717383">
+    <w:abstractNumId w:val="5"/>
+  </w:num>
+  <w:num w:numId="15" w16cid:durableId="1108429729">
+    <w:abstractNumId w:val="36"/>
+  </w:num>
+  <w:num w:numId="16" w16cid:durableId="987826685">
+    <w:abstractNumId w:val="31"/>
+  </w:num>
+  <w:num w:numId="17" w16cid:durableId="1357344658">
+    <w:abstractNumId w:val="30"/>
+  </w:num>
+  <w:num w:numId="18" w16cid:durableId="1481114907">
+    <w:abstractNumId w:val="23"/>
+  </w:num>
+  <w:num w:numId="19" w16cid:durableId="1636062906">
     <w:abstractNumId w:val="8"/>
   </w:num>
-  <w:num w:numId="10" w16cid:durableId="1023937672">
-    <w:abstractNumId w:val="7"/>
-  </w:num>
-  <w:num w:numId="11" w16cid:durableId="1822305797">
-    <w:abstractNumId w:val="11"/>
-  </w:num>
-  <w:num w:numId="12" w16cid:durableId="240019855">
-    <w:abstractNumId w:val="16"/>
-  </w:num>
-  <w:num w:numId="13" w16cid:durableId="1588925654">
-    <w:abstractNumId w:val="25"/>
-  </w:num>
-  <w:num w:numId="14" w16cid:durableId="723717383">
-    <w:abstractNumId w:val="3"/>
-  </w:num>
-  <w:num w:numId="15" w16cid:durableId="1108429729">
-    <w:abstractNumId w:val="21"/>
-  </w:num>
-  <w:num w:numId="16" w16cid:durableId="987826685">
-    <w:abstractNumId w:val="18"/>
-  </w:num>
-  <w:num w:numId="17" w16cid:durableId="1357344658">
-    <w:abstractNumId w:val="17"/>
-  </w:num>
-  <w:num w:numId="18" w16cid:durableId="1481114907">
-    <w:abstractNumId w:val="14"/>
-  </w:num>
-  <w:num w:numId="19" w16cid:durableId="1636062906">
-    <w:abstractNumId w:val="4"/>
-  </w:num>
   <w:num w:numId="20" w16cid:durableId="45683780">
-    <w:abstractNumId w:val="5"/>
+    <w:abstractNumId w:val="9"/>
   </w:num>
   <w:num w:numId="21" w16cid:durableId="63575087">
-    <w:abstractNumId w:val="22"/>
+    <w:abstractNumId w:val="37"/>
   </w:num>
   <w:num w:numId="22" w16cid:durableId="1190409847">
     <w:abstractNumId w:val="0"/>
   </w:num>
   <w:num w:numId="23" w16cid:durableId="2134009853">
+    <w:abstractNumId w:val="20"/>
+  </w:num>
+  <w:num w:numId="24" w16cid:durableId="660281416">
+    <w:abstractNumId w:val="38"/>
+  </w:num>
+  <w:num w:numId="25" w16cid:durableId="1352804676">
+    <w:abstractNumId w:val="34"/>
+  </w:num>
+  <w:num w:numId="26" w16cid:durableId="1691375048">
     <w:abstractNumId w:val="13"/>
   </w:num>
-  <w:num w:numId="24" w16cid:durableId="660281416">
-    <w:abstractNumId w:val="23"/>
+  <w:num w:numId="27" w16cid:durableId="4135521">
+    <w:abstractNumId w:val="14"/>
   </w:num>
-  <w:num w:numId="25" w16cid:durableId="1352804676">
-    <w:abstractNumId w:val="20"/>
+  <w:num w:numId="28" w16cid:durableId="2136677342">
+    <w:abstractNumId w:val="6"/>
   </w:num>
-  <w:num w:numId="26" w16cid:durableId="1691375048">
-    <w:abstractNumId w:val="9"/>
+  <w:num w:numId="29" w16cid:durableId="559169536">
+    <w:abstractNumId w:val="26"/>
   </w:num>
-  <w:num w:numId="27" w16cid:durableId="4135521">
-    <w:abstractNumId w:val="10"/>
+  <w:num w:numId="30" w16cid:durableId="448357664">
+    <w:abstractNumId w:val="35"/>
+  </w:num>
+  <w:num w:numId="31" w16cid:durableId="1796097959">
+    <w:abstractNumId w:val="32"/>
+  </w:num>
+  <w:num w:numId="32" w16cid:durableId="121579182">
+    <w:abstractNumId w:val="19"/>
+  </w:num>
+  <w:num w:numId="33" w16cid:durableId="478425633">
+    <w:abstractNumId w:val="18"/>
+  </w:num>
+  <w:num w:numId="34" w16cid:durableId="1211457931">
+    <w:abstractNumId w:val="25"/>
+  </w:num>
+  <w:num w:numId="35" w16cid:durableId="1228420963">
+    <w:abstractNumId w:val="21"/>
+  </w:num>
+  <w:num w:numId="36" w16cid:durableId="553083807">
+    <w:abstractNumId w:val="3"/>
+  </w:num>
+  <w:num w:numId="37" w16cid:durableId="719744126">
+    <w:abstractNumId w:val="27"/>
+  </w:num>
+  <w:num w:numId="38" w16cid:durableId="86003908">
+    <w:abstractNumId w:val="24"/>
+  </w:num>
+  <w:num w:numId="39" w16cid:durableId="141431993">
+    <w:abstractNumId w:val="22"/>
+  </w:num>
+  <w:num w:numId="40" w16cid:durableId="1314213411">
+    <w:abstractNumId w:val="7"/>
+  </w:num>
+  <w:num w:numId="41" w16cid:durableId="2068608021">
+    <w:abstractNumId w:val="4"/>
+  </w:num>
+  <w:num w:numId="42" w16cid:durableId="1357807612">
+    <w:abstractNumId w:val="16"/>
   </w:num>
 </w:numbering>
 </file>

</xml_diff>